<commit_message>
Updated prerequisites and Moran folder
</commit_message>
<xml_diff>
--- a/Prerequisites/Instructions_Setup.docx
+++ b/Prerequisites/Instructions_Setup.docx
@@ -1,6 +1,6 @@
 
 <file path=word/document.xml><?xml version="1.0" encoding="utf-8"?>
-<w:document xmlns:wpc="http://schemas.microsoft.com/office/word/2010/wordprocessingCanvas" xmlns:cx="http://schemas.microsoft.com/office/drawing/2014/chartex" xmlns:cx1="http://schemas.microsoft.com/office/drawing/2015/9/8/chartex" xmlns:cx2="http://schemas.microsoft.com/office/drawing/2015/10/21/chartex" xmlns:cx3="http://schemas.microsoft.com/office/drawing/2016/5/9/chartex" xmlns:cx4="http://schemas.microsoft.com/office/drawing/2016/5/10/chartex" xmlns:cx5="http://schemas.microsoft.com/office/drawing/2016/5/11/chartex" xmlns:cx6="http://schemas.microsoft.com/office/drawing/2016/5/12/chartex" xmlns:cx7="http://schemas.microsoft.com/office/drawing/2016/5/13/chartex" xmlns:cx8="http://schemas.microsoft.com/office/drawing/2016/5/14/chartex" xmlns:mc="http://schemas.openxmlformats.org/markup-compatibility/2006" xmlns:aink="http://schemas.microsoft.com/office/drawing/2016/ink" xmlns:am3d="http://schemas.microsoft.com/office/drawing/2017/model3d" xmlns:o="urn:schemas-microsoft-com:office:office" xmlns:oel="http://schemas.microsoft.com/office/2019/extlst" xmlns:r="http://schemas.openxmlformats.org/officeDocument/2006/relationships" xmlns:m="http://schemas.openxmlformats.org/officeDocument/2006/math" xmlns:v="urn:schemas-microsoft-com:vml" xmlns:wp14="http://schemas.microsoft.com/office/word/2010/wordprocessingDrawing" xmlns:wp="http://schemas.openxmlformats.org/drawingml/2006/wordprocessingDrawing" xmlns:w10="urn:schemas-microsoft-com:office:word" xmlns:w="http://schemas.openxmlformats.org/wordprocessingml/2006/main" xmlns:w14="http://schemas.microsoft.com/office/word/2010/wordml" xmlns:w15="http://schemas.microsoft.com/office/word/2012/wordml" xmlns:w16cex="http://schemas.microsoft.com/office/word/2018/wordml/cex" xmlns:w16cid="http://schemas.microsoft.com/office/word/2016/wordml/cid" xmlns:w16="http://schemas.microsoft.com/office/word/2018/wordml" xmlns:w16du="http://schemas.microsoft.com/office/word/2023/wordml/word16du" xmlns:w16sdtdh="http://schemas.microsoft.com/office/word/2020/wordml/sdtdatahash" xmlns:w16sdtfl="http://schemas.microsoft.com/office/word/2024/wordml/sdtformatlock" xmlns:w16se="http://schemas.microsoft.com/office/word/2015/wordml/symex" xmlns:wpg="http://schemas.microsoft.com/office/word/2010/wordprocessingGroup" xmlns:wpi="http://schemas.microsoft.com/office/word/2010/wordprocessingInk" xmlns:wne="http://schemas.microsoft.com/office/word/2006/wordml" xmlns:wps="http://schemas.microsoft.com/office/word/2010/wordprocessingShape" mc:Ignorable="w14 w15 w16se w16cid w16 w16cex w16sdtdh w16sdtfl w16du wp14">
+<w:document xmlns:wpc="http://schemas.microsoft.com/office/word/2010/wordprocessingCanvas" xmlns:cx="http://schemas.microsoft.com/office/drawing/2014/chartex" xmlns:cx1="http://schemas.microsoft.com/office/drawing/2015/9/8/chartex" xmlns:cx2="http://schemas.microsoft.com/office/drawing/2015/10/21/chartex" xmlns:cx3="http://schemas.microsoft.com/office/drawing/2016/5/9/chartex" xmlns:cx4="http://schemas.microsoft.com/office/drawing/2016/5/10/chartex" xmlns:cx5="http://schemas.microsoft.com/office/drawing/2016/5/11/chartex" xmlns:cx6="http://schemas.microsoft.com/office/drawing/2016/5/12/chartex" xmlns:cx7="http://schemas.microsoft.com/office/drawing/2016/5/13/chartex" xmlns:cx8="http://schemas.microsoft.com/office/drawing/2016/5/14/chartex" xmlns:mc="http://schemas.openxmlformats.org/markup-compatibility/2006" xmlns:aink="http://schemas.microsoft.com/office/drawing/2016/ink" xmlns:am3d="http://schemas.microsoft.com/office/drawing/2017/model3d" xmlns:o="urn:schemas-microsoft-com:office:office" xmlns:oel="http://schemas.microsoft.com/office/2019/extlst" xmlns:r="http://schemas.openxmlformats.org/officeDocument/2006/relationships" xmlns:m="http://schemas.openxmlformats.org/officeDocument/2006/math" xmlns:v="urn:schemas-microsoft-com:vml" xmlns:wp14="http://schemas.microsoft.com/office/word/2010/wordprocessingDrawing" xmlns:wp="http://schemas.openxmlformats.org/drawingml/2006/wordprocessingDrawing" xmlns:w10="urn:schemas-microsoft-com:office:word" xmlns:w="http://schemas.openxmlformats.org/wordprocessingml/2006/main" xmlns:w14="http://schemas.microsoft.com/office/word/2010/wordml" xmlns:w15="http://schemas.microsoft.com/office/word/2012/wordml" xmlns:w16cex="http://schemas.microsoft.com/office/word/2018/wordml/cex" xmlns:w16cid="http://schemas.microsoft.com/office/word/2016/wordml/cid" xmlns:w16="http://schemas.microsoft.com/office/word/2018/wordml" xmlns:w16du="http://schemas.microsoft.com/office/word/2023/wordml/word16du" xmlns:w16sdtdh="http://schemas.microsoft.com/office/word/2020/wordml/sdtdatahash" xmlns:w16sdtfl="http://schemas.microsoft.com/office/word/2024/wordml/sdtformatlock" xmlns:w16se="http://schemas.microsoft.com/office/word/2015/wordml/symex" xmlns:wpg="http://schemas.microsoft.com/office/word/2010/wordprocessingGroup" xmlns:wpi="http://schemas.microsoft.com/office/word/2010/wordprocessingInk" xmlns:wne="http://schemas.microsoft.com/office/word/2006/wordml" xmlns:wps="http://schemas.microsoft.com/office/word/2010/wordprocessingShape" xmlns:a="http://schemas.openxmlformats.org/drawingml/2006/main" xmlns:pic="http://schemas.openxmlformats.org/drawingml/2006/picture" xmlns:a14="http://schemas.microsoft.com/office/drawing/2010/main" mc:Ignorable="w14 w15 w16se w16cid w16 w16cex w16sdtdh w16sdtfl w16du wp14">
   <w:body>
     <w:p>
       <w:pPr>
@@ -558,7 +558,6 @@
         <w:rPr>
           <w:lang w:val="en-US"/>
         </w:rPr>
-        <w:lastRenderedPageBreak/>
         <w:t xml:space="preserve">1.2. </w:t>
       </w:r>
       <w:r>
@@ -605,7 +604,7 @@
         </w:rPr>
         <w:t>Go to “</w:t>
       </w:r>
-      <w:hyperlink r:id="rId8" w:history="1">
+      <w:hyperlink w:history="1" r:id="rId8">
         <w:r>
           <w:rPr>
             <w:rStyle w:val="Hyperlink"/>
@@ -1245,7 +1244,6 @@
           <w:lang w:val="en-US" w:eastAsia="es-ES"/>
           <w14:ligatures w14:val="none"/>
         </w:rPr>
-        <w:lastRenderedPageBreak/>
         <w:t>You need to run this command on the PowerShell terminal:</w:t>
       </w:r>
     </w:p>
@@ -1460,7 +1458,7 @@
           <w:lang w:val="en-US"/>
         </w:rPr>
       </w:pPr>
-      <w:hyperlink r:id="rId10" w:history="1">
+      <w:hyperlink w:history="1" r:id="rId10">
         <w:r>
           <w:rPr>
             <w:rStyle w:val="Hyperlink"/>
@@ -1704,7 +1702,7 @@
       <w:pPr>
         <w:jc w:val="both"/>
         <w:rPr>
-          <w:rFonts w:asciiTheme="majorHAnsi" w:eastAsiaTheme="majorEastAsia" w:hAnsiTheme="majorHAnsi" w:cstheme="majorBidi"/>
+          <w:rFonts w:asciiTheme="majorHAnsi" w:hAnsiTheme="majorHAnsi" w:eastAsiaTheme="majorEastAsia" w:cstheme="majorBidi"/>
           <w:color w:val="0F4761" w:themeColor="accent1" w:themeShade="BF"/>
           <w:sz w:val="40"/>
           <w:szCs w:val="40"/>
@@ -1713,7 +1711,7 @@
       </w:pPr>
       <w:r>
         <w:rPr>
-          <w:rFonts w:asciiTheme="majorHAnsi" w:eastAsiaTheme="majorEastAsia" w:hAnsiTheme="majorHAnsi" w:cstheme="majorBidi"/>
+          <w:rFonts w:asciiTheme="majorHAnsi" w:hAnsiTheme="majorHAnsi" w:eastAsiaTheme="majorEastAsia" w:cstheme="majorBidi"/>
           <w:color w:val="0F4761" w:themeColor="accent1" w:themeShade="BF"/>
           <w:sz w:val="40"/>
           <w:szCs w:val="40"/>
@@ -1723,7 +1721,7 @@
       </w:r>
       <w:r>
         <w:rPr>
-          <w:rFonts w:asciiTheme="majorHAnsi" w:eastAsiaTheme="majorEastAsia" w:hAnsiTheme="majorHAnsi" w:cstheme="majorBidi"/>
+          <w:rFonts w:asciiTheme="majorHAnsi" w:hAnsiTheme="majorHAnsi" w:eastAsiaTheme="majorEastAsia" w:cstheme="majorBidi"/>
           <w:color w:val="0F4761" w:themeColor="accent1" w:themeShade="BF"/>
           <w:sz w:val="40"/>
           <w:szCs w:val="40"/>
@@ -1733,7 +1731,7 @@
       </w:r>
       <w:r>
         <w:rPr>
-          <w:rFonts w:asciiTheme="majorHAnsi" w:eastAsiaTheme="majorEastAsia" w:hAnsiTheme="majorHAnsi" w:cstheme="majorBidi"/>
+          <w:rFonts w:asciiTheme="majorHAnsi" w:hAnsiTheme="majorHAnsi" w:eastAsiaTheme="majorEastAsia" w:cstheme="majorBidi"/>
           <w:color w:val="0F4761" w:themeColor="accent1" w:themeShade="BF"/>
           <w:sz w:val="40"/>
           <w:szCs w:val="40"/>
@@ -1949,7 +1947,6 @@
         <w:rPr>
           <w:lang w:val="en-US"/>
         </w:rPr>
-        <w:lastRenderedPageBreak/>
         <w:t xml:space="preserve">4. </w:t>
       </w:r>
       <w:r>
@@ -2540,7 +2537,31 @@
         <w:rPr>
           <w:lang w:val="en-US"/>
         </w:rPr>
-        <w:t xml:space="preserve"> the two following commands separately. Note some installations may take a few minutes.</w:t>
+        <w:t xml:space="preserve"> the </w:t>
+      </w:r>
+      <w:r>
+        <w:rPr>
+          <w:lang w:val="en-US"/>
+        </w:rPr>
+        <w:t xml:space="preserve">two </w:t>
+      </w:r>
+      <w:r>
+        <w:rPr>
+          <w:lang w:val="en-US"/>
+        </w:rPr>
+        <w:t xml:space="preserve">following commands separately. </w:t>
+      </w:r>
+      <w:r>
+        <w:rPr>
+          <w:lang w:val="en-US"/>
+        </w:rPr>
+        <w:t>Note</w:t>
+      </w:r>
+      <w:r>
+        <w:rPr>
+          <w:lang w:val="en-US"/>
+        </w:rPr>
+        <w:t xml:space="preserve"> some installations may take a few minutes.</w:t>
       </w:r>
     </w:p>
     <w:p>
@@ -2551,28 +2572,36 @@
           <w:lang w:val="en-US"/>
         </w:rPr>
       </w:pPr>
-      <w:proofErr w:type="spellStart"/>
       <w:r>
         <w:rPr>
           <w:lang w:val="en-US"/>
         </w:rPr>
         <w:t>conda</w:t>
       </w:r>
-      <w:proofErr w:type="spellEnd"/>
       <w:r>
         <w:rPr>
           <w:lang w:val="en-US"/>
         </w:rPr>
         <w:t xml:space="preserve"> env create -f </w:t>
       </w:r>
-      <w:proofErr w:type="spellStart"/>
-      <w:r>
-        <w:rPr>
-          <w:lang w:val="en-US"/>
-        </w:rPr>
-        <w:t>cheminf.yaml</w:t>
-      </w:r>
-      <w:proofErr w:type="spellEnd"/>
+      <w:r>
+        <w:rPr>
+          <w:lang w:val="en-US"/>
+        </w:rPr>
+        <w:t>env4camlc_chem</w:t>
+      </w:r>
+      <w:r>
+        <w:rPr>
+          <w:lang w:val="en-US"/>
+        </w:rPr>
+        <w:t>inf</w:t>
+      </w:r>
+      <w:r>
+        <w:rPr>
+          <w:lang w:val="en-US"/>
+        </w:rPr>
+        <w:t>.yaml</w:t>
+      </w:r>
     </w:p>
     <w:p>
       <w:pPr>
@@ -2582,26 +2611,23 @@
           <w:lang w:val="en-US"/>
         </w:rPr>
       </w:pPr>
-      <w:proofErr w:type="spellStart"/>
       <w:r>
         <w:rPr>
           <w:lang w:val="en-US"/>
         </w:rPr>
         <w:t>conda</w:t>
       </w:r>
-      <w:proofErr w:type="spellEnd"/>
       <w:r>
         <w:rPr>
           <w:lang w:val="en-US"/>
         </w:rPr>
         <w:t xml:space="preserve"> env create -f </w:t>
       </w:r>
-      <w:proofErr w:type="spellStart"/>
-      <w:r>
-        <w:rPr>
-          <w:lang w:val="en-US"/>
-        </w:rPr>
-        <w:t>bayesian</w:t>
+      <w:r>
+        <w:rPr>
+          <w:lang w:val="en-US"/>
+        </w:rPr>
+        <w:t>env4camlc_baybe</w:t>
       </w:r>
       <w:r>
         <w:rPr>
@@ -2609,22 +2635,276 @@
         </w:rPr>
         <w:t>.yaml</w:t>
       </w:r>
-      <w:proofErr w:type="spellEnd"/>
     </w:p>
     <w:p>
       <w:pPr>
         <w:spacing w:after="360"/>
         <w:jc w:val="both"/>
         <w:rPr>
+          <w:lang w:val="fi-FI"/>
+        </w:rPr>
+      </w:pPr>
+      <w:r>
+        <w:rPr>
+          <w:lang w:val="fi-FI"/>
+        </w:rPr>
+        <w:t xml:space="preserve">4.2.3. </w:t>
+      </w:r>
+      <w:r>
+        <w:rPr>
+          <w:lang w:val="fi-FI"/>
+        </w:rPr>
+        <w:t xml:space="preserve">Depending on your </w:t>
+      </w:r>
+      <w:r>
+        <w:rPr>
+          <w:lang w:val="fi-FI"/>
+        </w:rPr>
+        <w:t xml:space="preserve">operating </w:t>
+      </w:r>
+      <w:r>
+        <w:rPr>
+          <w:lang w:val="fi-FI"/>
+        </w:rPr>
+        <w:t>system, you will need t</w:t>
+      </w:r>
+      <w:r>
+        <w:rPr>
+          <w:lang w:val="fi-FI"/>
+        </w:rPr>
+        <w:t xml:space="preserve">o run the </w:t>
+      </w:r>
+      <w:r>
+        <w:rPr>
+          <w:lang w:val="fi-FI"/>
+        </w:rPr>
+        <w:t>following</w:t>
+      </w:r>
+      <w:r>
+        <w:rPr>
+          <w:lang w:val="fi-FI"/>
+        </w:rPr>
+        <w:t xml:space="preserve"> commands:</w:t>
+      </w:r>
+    </w:p>
+    <w:p>
+      <w:pPr>
+        <w:spacing w:after="360"/>
+        <w:jc w:val="both"/>
+        <w:rPr>
           <w:lang w:val="en-GB"/>
         </w:rPr>
       </w:pPr>
-    </w:p>
-    <w:p>
-      <w:pPr>
-        <w:jc w:val="both"/>
-        <w:rPr>
-          <w:rFonts w:asciiTheme="majorHAnsi" w:eastAsiaTheme="majorEastAsia" w:hAnsiTheme="majorHAnsi" w:cstheme="majorBidi"/>
+      <w:r>
+        <w:rPr>
+          <w:lang w:val="en-GB"/>
+        </w:rPr>
+        <w:t xml:space="preserve">4.2.3.1. </w:t>
+      </w:r>
+      <w:r>
+        <w:rPr>
+          <w:lang w:val="en-GB"/>
+        </w:rPr>
+        <w:t>Linux</w:t>
+      </w:r>
+    </w:p>
+    <w:p>
+      <w:pPr>
+        <w:spacing w:after="360"/>
+        <w:jc w:val="both"/>
+        <w:rPr>
+          <w:lang w:val="en-GB"/>
+        </w:rPr>
+      </w:pPr>
+      <w:r>
+        <w:rPr>
+          <w:rFonts w:ascii="Aptos" w:hAnsi="Aptos" w:eastAsia="Aptos" w:cs="Aptos"/>
+          <w:noProof w:val="0"/>
+          <w:sz w:val="22"/>
+          <w:szCs w:val="22"/>
+          <w:lang w:val="en-GB"/>
+        </w:rPr>
+        <w:t>First, grant execution permissions.</w:t>
+      </w:r>
+    </w:p>
+    <w:p>
+      <w:pPr>
+        <w:pStyle w:val="Normal"/>
+        <w:suppressLineNumbers w:val="0"/>
+        <w:shd w:val="clear" w:color="auto" w:fill="E8E8E8" w:themeFill="background2"/>
+        <w:bidi w:val="0"/>
+        <w:spacing w:before="0" w:beforeAutospacing="off" w:after="160" w:afterAutospacing="off" w:line="259" w:lineRule="auto"/>
+        <w:ind w:left="0" w:right="0"/>
+        <w:jc w:val="both"/>
+      </w:pPr>
+      <w:r>
+        <w:rPr>
+          <w:lang w:val="en-US"/>
+        </w:rPr>
+        <w:t>chmod</w:t>
+      </w:r>
+      <w:r>
+        <w:rPr>
+          <w:lang w:val="en-US"/>
+        </w:rPr>
+        <w:t xml:space="preserve"> +x envrun_laplaza_linuxmac.sh</w:t>
+      </w:r>
+    </w:p>
+    <w:p>
+      <w:pPr>
+        <w:pStyle w:val="Normal"/>
+        <w:suppressLineNumbers w:val="0"/>
+        <w:shd w:val="clear" w:color="auto" w:fill="E8E8E8" w:themeFill="background2"/>
+        <w:bidi w:val="0"/>
+        <w:spacing w:before="0" w:beforeAutospacing="off" w:after="160" w:afterAutospacing="off" w:line="259" w:lineRule="auto"/>
+        <w:ind w:left="0" w:right="0"/>
+        <w:jc w:val="both"/>
+      </w:pPr>
+      <w:r>
+        <w:rPr>
+          <w:lang w:val="en-US"/>
+        </w:rPr>
+        <w:t>chmod</w:t>
+      </w:r>
+      <w:r>
+        <w:rPr>
+          <w:lang w:val="en-US"/>
+        </w:rPr>
+        <w:t xml:space="preserve"> +x env4heid_linuxmac.sh</w:t>
+      </w:r>
+    </w:p>
+    <w:p>
+      <w:pPr>
+        <w:spacing w:before="240" w:beforeAutospacing="off" w:after="240" w:afterAutospacing="off"/>
+        <w:jc w:val="both"/>
+      </w:pPr>
+      <w:r>
+        <w:rPr>
+          <w:rFonts w:ascii="Aptos" w:hAnsi="Aptos" w:eastAsia="Aptos" w:cs="Aptos"/>
+          <w:noProof w:val="0"/>
+          <w:sz w:val="22"/>
+          <w:szCs w:val="22"/>
+          <w:lang w:val="en-GB"/>
+        </w:rPr>
+        <w:t>Then, execute them:</w:t>
+      </w:r>
+    </w:p>
+    <w:p>
+      <w:pPr>
+        <w:pStyle w:val="Normal"/>
+        <w:suppressLineNumbers w:val="0"/>
+        <w:shd w:val="clear" w:color="auto" w:fill="E8E8E8" w:themeFill="background2"/>
+        <w:bidi w:val="0"/>
+        <w:spacing w:before="0" w:beforeAutospacing="off" w:after="160" w:afterAutospacing="off" w:line="259" w:lineRule="auto"/>
+        <w:ind w:left="0" w:right="0"/>
+        <w:jc w:val="both"/>
+      </w:pPr>
+      <w:r>
+        <w:rPr>
+          <w:lang w:val="en-US"/>
+        </w:rPr>
+        <w:t>./envrun_laplaza_linuxmac.sh</w:t>
+      </w:r>
+    </w:p>
+    <w:p>
+      <w:pPr>
+        <w:pStyle w:val="Normal"/>
+        <w:suppressLineNumbers w:val="0"/>
+        <w:shd w:val="clear" w:color="auto" w:fill="E8E8E8" w:themeFill="background2"/>
+        <w:bidi w:val="0"/>
+        <w:spacing w:before="0" w:beforeAutospacing="off" w:after="160" w:afterAutospacing="off" w:line="259" w:lineRule="auto"/>
+        <w:ind w:left="0" w:right="0"/>
+        <w:jc w:val="both"/>
+      </w:pPr>
+      <w:r>
+        <w:rPr>
+          <w:lang w:val="en-US"/>
+        </w:rPr>
+        <w:t>./env4heid_linuxmac.sh</w:t>
+      </w:r>
+    </w:p>
+    <w:p>
+      <w:pPr>
+        <w:spacing w:before="240" w:beforeAutospacing="off" w:after="240" w:afterAutospacing="off"/>
+        <w:jc w:val="both"/>
+        <w:rPr>
+          <w:rFonts w:ascii="Aptos" w:hAnsi="Aptos" w:eastAsia="Aptos" w:cs="Aptos"/>
+          <w:noProof w:val="0"/>
+          <w:sz w:val="22"/>
+          <w:szCs w:val="22"/>
+          <w:lang w:val="en-GB"/>
+        </w:rPr>
+      </w:pPr>
+      <w:r>
+        <w:rPr>
+          <w:rFonts w:ascii="Aptos" w:hAnsi="Aptos" w:eastAsia="Aptos" w:cs="Aptos"/>
+          <w:noProof w:val="0"/>
+          <w:sz w:val="22"/>
+          <w:szCs w:val="22"/>
+          <w:lang w:val="en-GB"/>
+        </w:rPr>
+        <w:t>4.2.3.2. Windows</w:t>
+      </w:r>
+    </w:p>
+    <w:p>
+      <w:pPr>
+        <w:pStyle w:val="Normal"/>
+        <w:suppressLineNumbers w:val="0"/>
+        <w:shd w:val="clear" w:color="auto" w:fill="E8E8E8" w:themeFill="background2"/>
+        <w:bidi w:val="0"/>
+        <w:spacing w:before="0" w:beforeAutospacing="off" w:after="160" w:afterAutospacing="off" w:line="259" w:lineRule="auto"/>
+        <w:ind w:left="0" w:right="0"/>
+        <w:jc w:val="both"/>
+      </w:pPr>
+      <w:r>
+        <w:rPr>
+          <w:lang w:val="en-US"/>
+        </w:rPr>
+        <w:t>envrun_laplaza_linuxmac.bat</w:t>
+      </w:r>
+    </w:p>
+    <w:p>
+      <w:pPr>
+        <w:pStyle w:val="Normal"/>
+        <w:suppressLineNumbers w:val="0"/>
+        <w:shd w:val="clear" w:color="auto" w:fill="E8E8E8" w:themeFill="background2"/>
+        <w:bidi w:val="0"/>
+        <w:spacing w:before="0" w:beforeAutospacing="off" w:after="160" w:afterAutospacing="off" w:line="259" w:lineRule="auto"/>
+        <w:ind w:left="0" w:right="0"/>
+        <w:jc w:val="both"/>
+      </w:pPr>
+      <w:r>
+        <w:rPr>
+          <w:lang w:val="en-US"/>
+        </w:rPr>
+        <w:t>env4heid_linuxmac.bat</w:t>
+      </w:r>
+    </w:p>
+    <w:p>
+      <w:pPr>
+        <w:pStyle w:val="Normal"/>
+        <w:suppressLineNumbers w:val="0"/>
+        <w:bidi w:val="0"/>
+        <w:spacing w:before="240" w:beforeAutospacing="off" w:after="240" w:afterAutospacing="off" w:line="259" w:lineRule="auto"/>
+        <w:ind w:left="0" w:right="0"/>
+        <w:jc w:val="both"/>
+      </w:pPr>
+      <w:r>
+        <w:rPr>
+          <w:rFonts w:ascii="Aptos" w:hAnsi="Aptos" w:eastAsia="Aptos" w:cs="Aptos"/>
+          <w:noProof w:val="0"/>
+          <w:sz w:val="22"/>
+          <w:szCs w:val="22"/>
+          <w:lang w:val="en-GB"/>
+        </w:rPr>
+        <w:t>Be aware that t</w:t>
+      </w:r>
+    </w:p>
+    <w:p>
+      <w:pPr>
+        <w:jc w:val="both"/>
+        <w:rPr>
+          <w:rFonts w:asciiTheme="majorHAnsi" w:hAnsiTheme="majorHAnsi" w:eastAsiaTheme="majorEastAsia" w:cstheme="majorBidi"/>
           <w:color w:val="0F4761" w:themeColor="accent1" w:themeShade="BF"/>
           <w:sz w:val="40"/>
           <w:szCs w:val="40"/>
@@ -2633,19 +2913,18 @@
       </w:pPr>
       <w:r>
         <w:rPr>
-          <w:rFonts w:asciiTheme="majorHAnsi" w:eastAsiaTheme="majorEastAsia" w:hAnsiTheme="majorHAnsi" w:cstheme="majorBidi"/>
-          <w:color w:val="0F4761" w:themeColor="accent1" w:themeShade="BF"/>
+          <w:rFonts w:ascii="Aptos Display" w:hAnsi="Aptos Display" w:eastAsia="新細明體" w:cs="" w:asciiTheme="majorAscii" w:hAnsiTheme="majorAscii" w:eastAsiaTheme="majorEastAsia" w:cstheme="majorBidi"/>
+          <w:color w:val="0F4761" w:themeColor="accent1" w:themeTint="FF" w:themeShade="BF"/>
           <w:sz w:val="40"/>
           <w:szCs w:val="40"/>
           <w:lang w:val="en-US"/>
         </w:rPr>
-        <w:lastRenderedPageBreak/>
         <w:t xml:space="preserve">5. </w:t>
       </w:r>
       <w:r>
         <w:rPr>
-          <w:rFonts w:asciiTheme="majorHAnsi" w:eastAsiaTheme="majorEastAsia" w:hAnsiTheme="majorHAnsi" w:cstheme="majorBidi"/>
-          <w:color w:val="0F4761" w:themeColor="accent1" w:themeShade="BF"/>
+          <w:rFonts w:ascii="Aptos Display" w:hAnsi="Aptos Display" w:eastAsia="新細明體" w:cs="" w:asciiTheme="majorAscii" w:hAnsiTheme="majorAscii" w:eastAsiaTheme="majorEastAsia" w:cstheme="majorBidi"/>
+          <w:color w:val="0F4761" w:themeColor="accent1" w:themeTint="FF" w:themeShade="BF"/>
           <w:sz w:val="40"/>
           <w:szCs w:val="40"/>
           <w:lang w:val="en-US"/>
@@ -2655,197 +2934,77 @@
     </w:p>
     <w:p>
       <w:pPr>
-        <w:pStyle w:val="Heading3"/>
-        <w:jc w:val="both"/>
-        <w:rPr>
-          <w:u w:val="single"/>
-          <w:lang w:val="en-US"/>
-        </w:rPr>
-      </w:pPr>
-      <w:r>
-        <w:rPr>
-          <w:u w:val="single"/>
-          <w:lang w:val="en-US"/>
-        </w:rPr>
-        <w:t xml:space="preserve">5.1. </w:t>
-      </w:r>
-      <w:proofErr w:type="spellStart"/>
-      <w:r>
-        <w:rPr>
-          <w:u w:val="single"/>
-          <w:lang w:val="en-US"/>
-        </w:rPr>
-        <w:t>c</w:t>
-      </w:r>
-      <w:r>
-        <w:rPr>
-          <w:u w:val="single"/>
-          <w:lang w:val="en-US"/>
-        </w:rPr>
-        <w:t>heminf</w:t>
-      </w:r>
-      <w:proofErr w:type="spellEnd"/>
-      <w:r>
-        <w:rPr>
-          <w:u w:val="single"/>
-          <w:lang w:val="en-US"/>
-        </w:rPr>
-        <w:t xml:space="preserve"> environment</w:t>
-      </w:r>
-    </w:p>
-    <w:p>
-      <w:pPr>
-        <w:pStyle w:val="Heading3"/>
-        <w:jc w:val="both"/>
-        <w:rPr>
-          <w:lang w:val="en-US"/>
-        </w:rPr>
-      </w:pPr>
-      <w:r>
-        <w:rPr>
-          <w:lang w:val="en-US"/>
-        </w:rPr>
-        <w:t>5.1.</w:t>
-      </w:r>
-      <w:r>
-        <w:rPr>
-          <w:lang w:val="en-US"/>
-        </w:rPr>
-        <w:t>1.</w:t>
-      </w:r>
-      <w:r>
-        <w:rPr>
-          <w:lang w:val="en-US"/>
-        </w:rPr>
-        <w:t xml:space="preserve"> </w:t>
-      </w:r>
-      <w:r>
-        <w:rPr>
-          <w:lang w:val="en-US"/>
-        </w:rPr>
-        <w:t>Open</w:t>
-      </w:r>
-      <w:r>
-        <w:rPr>
-          <w:lang w:val="en-US"/>
-        </w:rPr>
-        <w:t xml:space="preserve">, using VSC, the </w:t>
-      </w:r>
-      <w:r>
-        <w:rPr>
-          <w:lang w:val="en-US"/>
-        </w:rPr>
-        <w:t>“</w:t>
-      </w:r>
-      <w:proofErr w:type="spellStart"/>
-      <w:r>
-        <w:rPr>
-          <w:lang w:val="en-US"/>
-        </w:rPr>
-        <w:t>cheminf</w:t>
-      </w:r>
-      <w:r>
-        <w:rPr>
-          <w:lang w:val="en-US"/>
-        </w:rPr>
-        <w:t>_setup.ipynb</w:t>
-      </w:r>
-      <w:proofErr w:type="spellEnd"/>
-      <w:r>
-        <w:rPr>
-          <w:lang w:val="en-US"/>
-        </w:rPr>
-        <w:t xml:space="preserve">” </w:t>
-      </w:r>
-      <w:proofErr w:type="spellStart"/>
+        <w:pStyle w:val="Normal"/>
+        <w:jc w:val="both"/>
+        <w:rPr>
+          <w:lang w:val="en-US"/>
+        </w:rPr>
+      </w:pPr>
+      <w:r>
+        <w:rPr>
+          <w:lang w:val="en-US"/>
+        </w:rPr>
+        <w:t xml:space="preserve">Open, using VSC, the “check_workshop_envs.ipynb” </w:t>
+      </w:r>
       <w:r>
         <w:rPr>
           <w:lang w:val="en-US"/>
         </w:rPr>
         <w:t>Jupyter</w:t>
       </w:r>
-      <w:proofErr w:type="spellEnd"/>
-      <w:r>
-        <w:rPr>
-          <w:lang w:val="en-US"/>
-        </w:rPr>
-        <w:t xml:space="preserve"> Notebook unzipped from the previous step</w:t>
-      </w:r>
-      <w:r>
-        <w:rPr>
-          <w:lang w:val="en-US"/>
-        </w:rPr>
-        <w:t xml:space="preserve"> (in the “</w:t>
-      </w:r>
-      <w:r>
-        <w:rPr>
-          <w:lang w:val="en-US"/>
-        </w:rPr>
-        <w:t>ML_course</w:t>
-      </w:r>
-      <w:r>
-        <w:rPr>
-          <w:lang w:val="en-US"/>
-        </w:rPr>
-        <w:t>/</w:t>
-      </w:r>
-      <w:r>
-        <w:rPr>
-          <w:lang w:val="en-US"/>
-        </w:rPr>
-        <w:t>Prerequisites</w:t>
-      </w:r>
-      <w:r>
-        <w:rPr>
-          <w:lang w:val="en-US"/>
-        </w:rPr>
-        <w:t>/</w:t>
-      </w:r>
-      <w:proofErr w:type="spellStart"/>
+      <w:r>
+        <w:rPr>
+          <w:lang w:val="en-US"/>
+        </w:rPr>
+        <w:t xml:space="preserve"> Notebook unzipped from the </w:t>
+      </w:r>
+      <w:r>
+        <w:rPr>
+          <w:lang w:val="en-US"/>
+        </w:rPr>
+        <w:t>previous</w:t>
+      </w:r>
+      <w:r>
+        <w:rPr>
+          <w:lang w:val="en-US"/>
+        </w:rPr>
+        <w:t xml:space="preserve"> step (in the “ML_course/Prerequisites/</w:t>
+      </w:r>
       <w:r>
         <w:rPr>
           <w:lang w:val="en-US"/>
         </w:rPr>
         <w:t>Setup_and_testing</w:t>
       </w:r>
-      <w:proofErr w:type="spellEnd"/>
-      <w:r>
-        <w:rPr>
-          <w:lang w:val="en-US"/>
-        </w:rPr>
-        <w:t>” folder)</w:t>
-      </w:r>
-      <w:r>
-        <w:rPr>
-          <w:lang w:val="en-US"/>
-        </w:rPr>
-        <w:t>.</w:t>
-      </w:r>
-    </w:p>
-    <w:p>
-      <w:pPr>
-        <w:jc w:val="both"/>
-        <w:rPr>
-          <w:lang w:val="en-US"/>
-        </w:rPr>
-      </w:pPr>
-      <w:r>
-        <w:rPr>
-          <w:lang w:val="en-US"/>
+      <w:r>
+        <w:rPr>
+          <w:lang w:val="en-US"/>
+        </w:rPr>
+        <w:t>” folder).</w:t>
+      </w:r>
+    </w:p>
+    <w:p>
+      <w:pPr>
+        <w:jc w:val="both"/>
+        <w:rPr>
+          <w:lang w:val="fi-FI"/>
+        </w:rPr>
+      </w:pPr>
+      <w:r>
+        <w:rPr>
+          <w:lang w:val="fi-FI"/>
         </w:rPr>
         <w:t>* (.</w:t>
       </w:r>
-      <w:proofErr w:type="spellStart"/>
-      <w:r>
-        <w:rPr>
-          <w:lang w:val="en-US"/>
+      <w:r>
+        <w:rPr>
+          <w:lang w:val="fi-FI"/>
         </w:rPr>
         <w:t>ipynb</w:t>
       </w:r>
-      <w:proofErr w:type="spellEnd"/>
-      <w:r>
-        <w:rPr>
-          <w:lang w:val="en-US"/>
+      <w:r>
+        <w:rPr>
+          <w:lang w:val="fi-FI"/>
         </w:rPr>
         <w:t xml:space="preserve"> means Interactive Python Notebook)</w:t>
       </w:r>
@@ -2918,20 +3077,16 @@
         </w:rPr>
       </w:pPr>
       <w:r>
-        <w:rPr>
-          <w:noProof/>
-          <w:lang w:val="en-US"/>
-        </w:rPr>
         <w:drawing>
-          <wp:inline distT="0" distB="0" distL="0" distR="0" wp14:anchorId="46008A55" wp14:editId="72FA7AB9">
+          <wp:inline wp14:editId="05648E6D" wp14:anchorId="46008A55">
             <wp:extent cx="4377565" cy="1661160"/>
             <wp:effectExtent l="0" t="0" r="4445" b="0"/>
             <wp:docPr id="1549508698" name="Picture 1"/>
             <wp:cNvGraphicFramePr>
-              <a:graphicFrameLocks xmlns:a="http://schemas.openxmlformats.org/drawingml/2006/main" noChangeAspect="1"/>
+              <a:graphicFrameLocks noChangeAspect="1"/>
             </wp:cNvGraphicFramePr>
-            <a:graphic xmlns:a="http://schemas.openxmlformats.org/drawingml/2006/main">
-              <a:graphicData uri="http://schemas.openxmlformats.org/drawingml/2006/picture">
+            <a:graphic>
+              <a:graphicData xmlns:a="http://schemas.openxmlformats.org/drawingml/2006/main" uri="http://schemas.openxmlformats.org/drawingml/2006/picture">
                 <pic:pic xmlns:pic="http://schemas.openxmlformats.org/drawingml/2006/picture">
                   <pic:nvPicPr>
                     <pic:cNvPr id="0" name="Picture 1"/>
@@ -2940,7 +3095,7 @@
                     </pic:cNvPicPr>
                   </pic:nvPicPr>
                   <pic:blipFill rotWithShape="1">
-                    <a:blip r:embed="rId13">
+                    <a:blip xmlns:r="http://schemas.openxmlformats.org/officeDocument/2006/relationships" r:embed="rId13">
                       <a:extLst>
                         <a:ext uri="{28A0092B-C50C-407E-A947-70E740481C1C}">
                           <a14:useLocalDpi xmlns:a14="http://schemas.microsoft.com/office/drawing/2010/main" val="0"/>
@@ -2979,156 +3134,39 @@
     </w:p>
     <w:p>
       <w:pPr>
-        <w:jc w:val="both"/>
-        <w:rPr>
-          <w:lang w:val="en-US"/>
-        </w:rPr>
-      </w:pPr>
-      <w:r>
-        <w:rPr>
-          <w:noProof/>
-          <w:lang w:val="en-US"/>
-        </w:rPr>
+        <w:pStyle w:val="Normal"/>
+        <w:jc w:val="both"/>
+        <w:rPr>
+          <w:b w:val="1"/>
+          <w:bCs w:val="1"/>
+          <w:highlight w:val="yellow"/>
+          <w:lang w:val="en-US"/>
+        </w:rPr>
+      </w:pPr>
+      <w:r>
         <w:drawing>
-          <wp:inline distT="0" distB="0" distL="0" distR="0" wp14:anchorId="5E9A102C" wp14:editId="638A8D5D">
-            <wp:extent cx="2902244" cy="1691640"/>
-            <wp:effectExtent l="0" t="0" r="0" b="3810"/>
-            <wp:docPr id="1995852653" name="Picture 2"/>
+          <wp:inline wp14:editId="52B14D5B" wp14:anchorId="303295F5">
+            <wp:extent cx="4210050" cy="1171575"/>
+            <wp:effectExtent l="0" t="0" r="0" b="0"/>
+            <wp:docPr id="1596617203" name="drawing"/>
             <wp:cNvGraphicFramePr>
-              <a:graphicFrameLocks xmlns:a="http://schemas.openxmlformats.org/drawingml/2006/main" noChangeAspect="1"/>
+              <a:graphicFrameLocks noChangeAspect="1"/>
             </wp:cNvGraphicFramePr>
-            <a:graphic xmlns:a="http://schemas.openxmlformats.org/drawingml/2006/main">
-              <a:graphicData uri="http://schemas.openxmlformats.org/drawingml/2006/picture">
+            <a:graphic>
+              <a:graphicData xmlns:a="http://schemas.openxmlformats.org/drawingml/2006/main" uri="http://schemas.openxmlformats.org/drawingml/2006/picture">
                 <pic:pic xmlns:pic="http://schemas.openxmlformats.org/drawingml/2006/picture">
                   <pic:nvPicPr>
-                    <pic:cNvPr id="0" name="Picture 2"/>
-                    <pic:cNvPicPr>
-                      <a:picLocks noChangeAspect="1" noChangeArrowheads="1"/>
-                    </pic:cNvPicPr>
+                    <pic:cNvPr id="1982024985" name=""/>
+                    <pic:cNvPicPr/>
                   </pic:nvPicPr>
                   <pic:blipFill>
-                    <a:blip r:embed="rId14">
+                    <a:blip xmlns:r="http://schemas.openxmlformats.org/officeDocument/2006/relationships" r:embed="rId177929347">
                       <a:extLst>
-                        <a:ext uri="{28A0092B-C50C-407E-A947-70E740481C1C}">
+                        <a:ext xmlns:a="http://schemas.openxmlformats.org/drawingml/2006/main" uri="{28A0092B-C50C-407E-A947-70E740481C1C}">
                           <a14:useLocalDpi xmlns:a14="http://schemas.microsoft.com/office/drawing/2010/main" val="0"/>
                         </a:ext>
                       </a:extLst>
                     </a:blip>
-                    <a:srcRect/>
-                    <a:stretch>
-                      <a:fillRect/>
-                    </a:stretch>
-                  </pic:blipFill>
-                  <pic:spPr bwMode="auto">
-                    <a:xfrm>
-                      <a:off x="0" y="0"/>
-                      <a:ext cx="2919213" cy="1701531"/>
-                    </a:xfrm>
-                    <a:prstGeom prst="rect">
-                      <a:avLst/>
-                    </a:prstGeom>
-                    <a:noFill/>
-                    <a:ln>
-                      <a:noFill/>
-                    </a:ln>
-                  </pic:spPr>
-                </pic:pic>
-              </a:graphicData>
-            </a:graphic>
-          </wp:inline>
-        </w:drawing>
-      </w:r>
-    </w:p>
-    <w:p>
-      <w:pPr>
-        <w:jc w:val="both"/>
-        <w:rPr>
-          <w:lang w:val="en-US"/>
-        </w:rPr>
-      </w:pPr>
-    </w:p>
-    <w:p>
-      <w:pPr>
-        <w:pStyle w:val="Heading3"/>
-        <w:jc w:val="both"/>
-        <w:rPr>
-          <w:lang w:val="en-US"/>
-        </w:rPr>
-      </w:pPr>
-      <w:r>
-        <w:rPr>
-          <w:lang w:val="en-US"/>
-        </w:rPr>
-        <w:t>5.</w:t>
-      </w:r>
-      <w:r>
-        <w:rPr>
-          <w:lang w:val="en-US"/>
-        </w:rPr>
-        <w:t>1.</w:t>
-      </w:r>
-      <w:r>
-        <w:rPr>
-          <w:lang w:val="en-US"/>
-        </w:rPr>
-        <w:t xml:space="preserve">2. </w:t>
-      </w:r>
-      <w:r>
-        <w:rPr>
-          <w:lang w:val="en-US"/>
-        </w:rPr>
-        <w:t>When VSC opens, s</w:t>
-      </w:r>
-      <w:r>
-        <w:rPr>
-          <w:lang w:val="en-US"/>
-        </w:rPr>
-        <w:t xml:space="preserve">elect the </w:t>
-      </w:r>
-      <w:proofErr w:type="spellStart"/>
-      <w:r>
-        <w:rPr>
-          <w:lang w:val="en-US"/>
-        </w:rPr>
-        <w:t>cheminf</w:t>
-      </w:r>
-      <w:proofErr w:type="spellEnd"/>
-      <w:r>
-        <w:rPr>
-          <w:lang w:val="en-US"/>
-        </w:rPr>
-        <w:t xml:space="preserve"> kernel</w:t>
-      </w:r>
-    </w:p>
-    <w:p>
-      <w:pPr>
-        <w:jc w:val="both"/>
-        <w:rPr>
-          <w:lang w:val="en-US"/>
-        </w:rPr>
-      </w:pPr>
-      <w:r>
-        <w:rPr>
-          <w:noProof/>
-          <w:lang w:val="en-US" w:eastAsia="es-ES"/>
-        </w:rPr>
-        <w:drawing>
-          <wp:inline distT="0" distB="0" distL="0" distR="0" wp14:anchorId="24D20D04" wp14:editId="28BFAD6F">
-            <wp:extent cx="5656580" cy="709930"/>
-            <wp:effectExtent l="0" t="0" r="1270" b="0"/>
-            <wp:docPr id="1378279774" name="Imagen 1" descr="Captura de pantalla con la imagen de una pantalla&#10;&#10;El contenido generado por IA puede ser incorrecto."/>
-            <wp:cNvGraphicFramePr>
-              <a:graphicFrameLocks xmlns:a="http://schemas.openxmlformats.org/drawingml/2006/main" noChangeAspect="1"/>
-            </wp:cNvGraphicFramePr>
-            <a:graphic xmlns:a="http://schemas.openxmlformats.org/drawingml/2006/main">
-              <a:graphicData uri="http://schemas.openxmlformats.org/drawingml/2006/picture">
-                <pic:pic xmlns:pic="http://schemas.openxmlformats.org/drawingml/2006/picture">
-                  <pic:nvPicPr>
-                    <pic:cNvPr id="1378279774" name="Imagen 1" descr="Captura de pantalla con la imagen de una pantalla&#10;&#10;El contenido generado por IA puede ser incorrecto."/>
-                    <pic:cNvPicPr/>
-                  </pic:nvPicPr>
-                  <pic:blipFill>
-                    <a:blip r:embed="rId15"/>
                     <a:stretch>
                       <a:fillRect/>
                     </a:stretch>
@@ -3136,7 +3174,7 @@
                   <pic:spPr>
                     <a:xfrm>
                       <a:off x="0" y="0"/>
-                      <a:ext cx="5656580" cy="709930"/>
+                      <a:ext cx="4210050" cy="1171575"/>
                     </a:xfrm>
                     <a:prstGeom prst="rect">
                       <a:avLst/>
@@ -3151,46 +3189,197 @@
     </w:p>
     <w:p>
       <w:pPr>
-        <w:jc w:val="both"/>
-        <w:rPr>
-          <w:lang w:val="en-US"/>
-        </w:rPr>
-      </w:pPr>
-    </w:p>
-    <w:p>
-      <w:pPr>
         <w:pStyle w:val="Heading3"/>
-        <w:jc w:val="both"/>
-        <w:rPr>
-          <w:i/>
-          <w:iCs/>
-          <w:lang w:val="en-US"/>
-        </w:rPr>
-      </w:pPr>
-      <w:r>
-        <w:rPr>
-          <w:lang w:val="en-US"/>
-        </w:rPr>
-        <w:lastRenderedPageBreak/>
+        <w:suppressLineNumbers w:val="0"/>
+        <w:bidi w:val="0"/>
+        <w:spacing w:before="160" w:beforeAutospacing="off" w:after="80" w:afterAutospacing="off" w:line="259" w:lineRule="auto"/>
+        <w:ind w:left="0" w:right="0"/>
+        <w:jc w:val="both"/>
+        <w:rPr>
+          <w:lang w:val="en-US"/>
+        </w:rPr>
+      </w:pPr>
+      <w:r>
+        <w:rPr>
+          <w:lang w:val="en-US"/>
+        </w:rPr>
         <w:t>5.</w:t>
       </w:r>
       <w:r>
         <w:rPr>
           <w:lang w:val="en-US"/>
         </w:rPr>
-        <w:t>1.</w:t>
-      </w:r>
-      <w:r>
-        <w:rPr>
-          <w:lang w:val="en-US"/>
-        </w:rPr>
-        <w:t xml:space="preserve">3. </w:t>
-      </w:r>
-      <w:r>
-        <w:rPr>
-          <w:lang w:val="en-US"/>
-        </w:rPr>
-        <w:t xml:space="preserve">Run </w:t>
+        <w:t>1</w:t>
+      </w:r>
+      <w:r>
+        <w:rPr>
+          <w:lang w:val="en-US"/>
+        </w:rPr>
+        <w:t xml:space="preserve">. </w:t>
+      </w:r>
+      <w:r>
+        <w:rPr>
+          <w:lang w:val="en-US"/>
+        </w:rPr>
+        <w:t>When VSC opens, s</w:t>
+      </w:r>
+      <w:r>
+        <w:rPr>
+          <w:lang w:val="en-US"/>
+        </w:rPr>
+        <w:t xml:space="preserve">elect </w:t>
+      </w:r>
+      <w:r>
+        <w:rPr>
+          <w:lang w:val="en-US"/>
+        </w:rPr>
+        <w:t xml:space="preserve">each time the created </w:t>
+      </w:r>
+      <w:r>
+        <w:rPr>
+          <w:lang w:val="en-US"/>
+        </w:rPr>
+        <w:t xml:space="preserve">environment </w:t>
+      </w:r>
+      <w:r>
+        <w:rPr>
+          <w:lang w:val="en-US"/>
+        </w:rPr>
+        <w:t>kernel</w:t>
+      </w:r>
+      <w:r>
+        <w:rPr>
+          <w:lang w:val="en-US"/>
+        </w:rPr>
+        <w:t xml:space="preserve"> </w:t>
+      </w:r>
+      <w:r>
+        <w:rPr>
+          <w:lang w:val="en-US"/>
+        </w:rPr>
+        <w:t>and run the corresponding cell.</w:t>
+      </w:r>
+    </w:p>
+    <w:p>
+      <w:pPr>
+        <w:pStyle w:val="Normal"/>
+        <w:bidi w:val="0"/>
+        <w:rPr>
+          <w:lang w:val="en-US"/>
+        </w:rPr>
+      </w:pPr>
+      <w:r>
+        <w:rPr>
+          <w:noProof/>
+        </w:rPr>
+        <mc:AlternateContent xmlns:mc="http://schemas.openxmlformats.org/markup-compatibility/2006">
+          <mc:Choice xmlns:mc="http://schemas.openxmlformats.org/markup-compatibility/2006" Requires="wpg">
+            <w:drawing xmlns:w="http://schemas.openxmlformats.org/wordprocessingml/2006/main">
+              <wp:inline xmlns:wp="http://schemas.openxmlformats.org/drawingml/2006/wordprocessingDrawing" xmlns:wp14="http://schemas.microsoft.com/office/word/2010/wordprocessingDrawing" distT="0" distB="0" distL="0" distR="0" wp14:anchorId="5BADCFB2" wp14:editId="1D39C6C5">
+                <wp:extent xmlns:wp="http://schemas.openxmlformats.org/drawingml/2006/wordprocessingDrawing" cx="5729287" cy="1571625"/>
+                <wp:effectExtent xmlns:wp="http://schemas.openxmlformats.org/drawingml/2006/wordprocessingDrawing" l="0" t="0" r="24130" b="9525"/>
+                <wp:docPr xmlns:wp="http://schemas.openxmlformats.org/drawingml/2006/wordprocessingDrawing" id="1416997796" name="Group 1"/>
+                <wp:cNvGraphicFramePr xmlns:wp="http://schemas.openxmlformats.org/drawingml/2006/wordprocessingDrawing"/>
+                <a:graphic xmlns:a="http://schemas.openxmlformats.org/drawingml/2006/main">
+                  <a:graphicData uri="http://schemas.microsoft.com/office/word/2010/wordprocessingGroup">
+                    <wpg:wgp xmlns:wpg="http://schemas.microsoft.com/office/word/2010/wordprocessingGroup">
+                      <wpg:cNvGrpSpPr/>
+                      <wpg:grpSpPr>
+                        <a:xfrm>
+                          <a:off x="0" y="0"/>
+                          <a:ext cx="5729287" cy="1571625"/>
+                          <a:chOff x="0" y="0"/>
+                          <a:chExt cx="5729287" cy="1571625"/>
+                        </a:xfrm>
+                      </wpg:grpSpPr>
+                      <pic:pic xmlns:pic="http://schemas.openxmlformats.org/drawingml/2006/picture">
+                        <pic:nvPicPr>
+                          <pic:cNvPr id="541950124" name="Picture 541950124"/>
+                          <pic:cNvPicPr>
+                            <a:picLocks noChangeAspect="1"/>
+                          </pic:cNvPicPr>
+                        </pic:nvPicPr>
+                        <pic:blipFill>
+                          <a:blip xmlns:r="http://schemas.openxmlformats.org/officeDocument/2006/relationships" r:embed="rId1082103319"/>
+                          <a:stretch>
+                            <a:fillRect/>
+                          </a:stretch>
+                        </pic:blipFill>
+                        <pic:spPr>
+                          <a:xfrm>
+                            <a:off x="0" y="0"/>
+                            <a:ext cx="5724525" cy="1571625"/>
+                          </a:xfrm>
+                          <a:prstGeom prst="rect">
+                            <a:avLst/>
+                          </a:prstGeom>
+                        </pic:spPr>
+                      </pic:pic>
+                      <wps:wsp xmlns:wps="http://schemas.microsoft.com/office/word/2010/wordprocessingShape">
+                        <wps:cNvPr id="939183742" name="Rectangle 939183742"/>
+                        <wps:cNvSpPr/>
+                        <wps:spPr>
+                          <a:xfrm>
+                            <a:off x="4990306" y="141763"/>
+                            <a:ext cx="738981" cy="205581"/>
+                          </a:xfrm>
+                          <a:prstGeom prst="rect">
+                            <a:avLst/>
+                          </a:prstGeom>
+                          <a:noFill/>
+                          <a:ln>
+                            <a:solidFill>
+                              <a:srgbClr val="FFFF00"/>
+                            </a:solidFill>
+                          </a:ln>
+                        </wps:spPr>
+                        <wps:style>
+                          <a:lnRef idx="2">
+                            <a:schemeClr val="accent1">
+                              <a:shade val="50000"/>
+                            </a:schemeClr>
+                          </a:lnRef>
+                          <a:fillRef idx="1">
+                            <a:schemeClr val="accent1"/>
+                          </a:fillRef>
+                          <a:effectRef idx="0">
+                            <a:scrgbClr r="0" g="0" b="0"/>
+                          </a:effectRef>
+                          <a:fontRef idx="minor">
+                            <a:schemeClr val="lt1"/>
+                          </a:fontRef>
+                        </wps:style>
+                        <wps:bodyPr anchor="ctr"/>
+                      </wps:wsp>
+                    </wpg:wgp>
+                  </a:graphicData>
+                </a:graphic>
+              </wp:inline>
+            </w:drawing>
+          </mc:Choice>
+          <mc:Fallback xmlns:mc="http://schemas.openxmlformats.org/markup-compatibility/2006"/>
+        </mc:AlternateContent>
+      </w:r>
+    </w:p>
+    <w:p>
+      <w:pPr>
+        <w:pStyle w:val="Normal"/>
+        <w:bidi w:val="0"/>
+        <w:rPr>
+          <w:lang w:val="en-US"/>
+        </w:rPr>
+      </w:pPr>
+      <w:r>
+        <w:rPr>
+          <w:lang w:val="en-US"/>
+        </w:rPr>
+        <w:t xml:space="preserve">Note that: </w:t>
+      </w:r>
+      <w:r>
+        <w:rPr>
+          <w:lang w:val="en-US"/>
+        </w:rPr>
+        <w:t xml:space="preserve">If you do not see </w:t>
       </w:r>
       <w:r>
         <w:rPr>
@@ -3208,13 +3397,64 @@
         <w:rPr>
           <w:lang w:val="en-US"/>
         </w:rPr>
-        <w:t xml:space="preserve">code </w:t>
-      </w:r>
-      <w:r>
-        <w:rPr>
-          <w:lang w:val="en-US"/>
-        </w:rPr>
-        <w:t>cell</w:t>
+        <w:t>Jupyter</w:t>
+      </w:r>
+      <w:r>
+        <w:rPr>
+          <w:lang w:val="en-US"/>
+        </w:rPr>
+        <w:t xml:space="preserve"> kernel directly, just click on Python Environments and select the one you want to use</w:t>
+      </w:r>
+      <w:r>
+        <w:rPr>
+          <w:lang w:val="en-US"/>
+        </w:rPr>
+        <w:t>, and run as in</w:t>
+      </w:r>
+    </w:p>
+    <w:p>
+      <w:pPr>
+        <w:pStyle w:val="Heading3"/>
+        <w:jc w:val="both"/>
+        <w:rPr>
+          <w:lang w:val="en-US"/>
+        </w:rPr>
+      </w:pPr>
+      <w:r>
+        <w:rPr>
+          <w:lang w:val="en-US"/>
+        </w:rPr>
+        <w:t>5.</w:t>
+      </w:r>
+      <w:r>
+        <w:rPr>
+          <w:lang w:val="en-US"/>
+        </w:rPr>
+        <w:t>2</w:t>
+      </w:r>
+      <w:r>
+        <w:rPr>
+          <w:lang w:val="en-US"/>
+        </w:rPr>
+        <w:t xml:space="preserve">. </w:t>
+      </w:r>
+      <w:r>
+        <w:rPr>
+          <w:lang w:val="en-US"/>
+        </w:rPr>
+        <w:t xml:space="preserve">Check that each cell </w:t>
+      </w:r>
+      <w:r>
+        <w:rPr>
+          <w:lang w:val="en-US"/>
+        </w:rPr>
+        <w:t>indicates</w:t>
+      </w:r>
+      <w:r>
+        <w:rPr>
+          <w:lang w:val="en-US"/>
+        </w:rPr>
+        <w:t xml:space="preserve"> that the library or program ha</w:t>
       </w:r>
       <w:r>
         <w:rPr>
@@ -3226,135 +3466,130 @@
         <w:rPr>
           <w:lang w:val="en-US"/>
         </w:rPr>
-        <w:t xml:space="preserve"> by </w:t>
-      </w:r>
-      <w:r>
-        <w:rPr>
-          <w:lang w:val="en-US"/>
-        </w:rPr>
-        <w:t xml:space="preserve">clicking “Run All” (image), </w:t>
-      </w:r>
-      <w:r>
-        <w:rPr>
-          <w:lang w:val="en-US"/>
-        </w:rPr>
-        <w:t>placing the cursor on each cell an</w:t>
-      </w:r>
-      <w:r>
-        <w:rPr>
-          <w:lang w:val="en-US"/>
-        </w:rPr>
-        <w:t>d</w:t>
-      </w:r>
-      <w:r>
-        <w:rPr>
-          <w:lang w:val="en-US"/>
-        </w:rPr>
-        <w:t xml:space="preserve"> pressing the play button</w:t>
-      </w:r>
-      <w:r>
-        <w:rPr>
-          <w:lang w:val="en-US"/>
-        </w:rPr>
-        <w:t>,</w:t>
-      </w:r>
-      <w:r>
-        <w:rPr>
-          <w:lang w:val="en-US"/>
-        </w:rPr>
-        <w:t xml:space="preserve"> or</w:t>
-      </w:r>
-      <w:r>
-        <w:rPr>
-          <w:lang w:val="en-US"/>
-        </w:rPr>
-        <w:t xml:space="preserve"> pressing</w:t>
-      </w:r>
-      <w:r>
-        <w:rPr>
-          <w:lang w:val="en-US"/>
-        </w:rPr>
-        <w:t xml:space="preserve"> </w:t>
-      </w:r>
-      <w:r>
-        <w:rPr>
-          <w:i/>
-          <w:iCs/>
-          <w:lang w:val="en-US"/>
-        </w:rPr>
-        <w:t xml:space="preserve">Shift </w:t>
-      </w:r>
-      <w:r>
-        <w:rPr>
-          <w:lang w:val="en-US"/>
-        </w:rPr>
-        <w:t xml:space="preserve">+ </w:t>
-      </w:r>
-      <w:r>
-        <w:rPr>
-          <w:i/>
-          <w:iCs/>
-          <w:lang w:val="en-US"/>
-        </w:rPr>
-        <w:t>Enter</w:t>
-      </w:r>
-      <w:r>
-        <w:rPr>
-          <w:i/>
-          <w:iCs/>
-          <w:lang w:val="en-US"/>
-        </w:rPr>
-        <w:t>.</w:t>
-      </w:r>
-    </w:p>
-    <w:p>
-      <w:pPr>
-        <w:jc w:val="both"/>
-        <w:rPr>
-          <w:lang w:val="en-US"/>
-        </w:rPr>
-      </w:pPr>
-      <w:r>
-        <w:rPr>
-          <w:noProof/>
-          <w:lang w:val="en-US" w:eastAsia="es-ES"/>
-        </w:rPr>
+        <w:t xml:space="preserve"> been installed </w:t>
+      </w:r>
+      <w:r>
+        <w:rPr>
+          <w:lang w:val="en-US"/>
+        </w:rPr>
+        <w:t>correctly.</w:t>
+      </w:r>
+    </w:p>
+    <w:p>
+      <w:pPr>
+        <w:pStyle w:val="Heading3"/>
+        <w:jc w:val="both"/>
+        <w:rPr>
+          <w:b w:val="1"/>
+          <w:bCs w:val="1"/>
+          <w:color w:val="C00000"/>
+          <w:u w:val="single"/>
+          <w:lang w:val="en-US"/>
+        </w:rPr>
+      </w:pPr>
+      <w:r>
+        <w:rPr>
+          <w:b w:val="1"/>
+          <w:bCs w:val="1"/>
+          <w:color w:val="C00000"/>
+          <w:u w:val="single"/>
+          <w:lang w:val="en-US"/>
+        </w:rPr>
+        <w:t>IMPORTANT!</w:t>
+      </w:r>
+    </w:p>
+    <w:p>
+      <w:pPr>
+        <w:spacing w:before="240" w:beforeAutospacing="off" w:after="240" w:afterAutospacing="off"/>
+      </w:pPr>
+      <w:r>
+        <w:rPr>
+          <w:rFonts w:ascii="Aptos" w:hAnsi="Aptos" w:eastAsia="Aptos" w:cs="Aptos"/>
+          <w:noProof w:val="0"/>
+          <w:sz w:val="24"/>
+          <w:szCs w:val="24"/>
+          <w:lang w:val="en-US"/>
+        </w:rPr>
+        <w:t>Especially on Windows, there is a higher chance of installation errors. If, when running check_workshop_envs.ipynb, the message</w:t>
+      </w:r>
+    </w:p>
+    <w:p>
+      <w:pPr>
+        <w:spacing w:before="240" w:beforeAutospacing="off" w:after="240" w:afterAutospacing="off"/>
+      </w:pPr>
+      <w:r>
+        <w:rPr>
+          <w:rFonts w:ascii="Aptos" w:hAnsi="Aptos" w:eastAsia="Aptos" w:cs="Aptos"/>
+          <w:noProof w:val="0"/>
+          <w:sz w:val="24"/>
+          <w:szCs w:val="24"/>
+          <w:lang w:val="en-US"/>
+        </w:rPr>
+        <w:t>“Dependency check failed! No module named ‘aqme’.”</w:t>
+      </w:r>
+    </w:p>
+    <w:p>
+      <w:pPr>
+        <w:spacing w:before="240" w:beforeAutospacing="off" w:after="240" w:afterAutospacing="off"/>
+      </w:pPr>
+      <w:r>
+        <w:rPr>
+          <w:rFonts w:ascii="Aptos" w:hAnsi="Aptos" w:eastAsia="Aptos" w:cs="Aptos"/>
+          <w:noProof w:val="0"/>
+          <w:sz w:val="24"/>
+          <w:szCs w:val="24"/>
+          <w:lang w:val="en-US"/>
+        </w:rPr>
+        <w:t>(or any other missing library) appears, a useful troubleshooting step is to open a new cell and type:</w:t>
+      </w:r>
+    </w:p>
+    <w:p>
+      <w:pPr>
+        <w:pStyle w:val="Normal"/>
+        <w:rPr>
+          <w:i w:val="1"/>
+          <w:iCs w:val="1"/>
+          <w:sz w:val="24"/>
+          <w:szCs w:val="24"/>
+          <w:lang w:val="en-US"/>
+        </w:rPr>
+      </w:pPr>
+      <w:r>
         <w:drawing>
-          <wp:inline distT="0" distB="0" distL="0" distR="0" wp14:anchorId="46705195" wp14:editId="46505252">
-            <wp:extent cx="5656580" cy="2225040"/>
-            <wp:effectExtent l="0" t="0" r="1270" b="3810"/>
-            <wp:docPr id="1826980197" name="Imagen 1" descr="Texto&#10;&#10;El contenido generado por IA puede ser incorrecto."/>
+          <wp:inline wp14:editId="258CF481" wp14:anchorId="523CFE96">
+            <wp:extent cx="5724525" cy="485775"/>
+            <wp:effectExtent l="0" t="0" r="0" b="0"/>
+            <wp:docPr id="526279549" name="drawing"/>
             <wp:cNvGraphicFramePr>
-              <a:graphicFrameLocks xmlns:a="http://schemas.openxmlformats.org/drawingml/2006/main" noChangeAspect="1"/>
+              <a:graphicFrameLocks noChangeAspect="1"/>
             </wp:cNvGraphicFramePr>
-            <a:graphic xmlns:a="http://schemas.openxmlformats.org/drawingml/2006/main">
-              <a:graphicData uri="http://schemas.openxmlformats.org/drawingml/2006/picture">
+            <a:graphic>
+              <a:graphicData xmlns:a="http://schemas.openxmlformats.org/drawingml/2006/main" uri="http://schemas.openxmlformats.org/drawingml/2006/picture">
                 <pic:pic xmlns:pic="http://schemas.openxmlformats.org/drawingml/2006/picture">
                   <pic:nvPicPr>
-                    <pic:cNvPr id="1826980197" name="Imagen 1" descr="Texto&#10;&#10;El contenido generado por IA puede ser incorrecto."/>
+                    <pic:cNvPr id="526279549" name=""/>
                     <pic:cNvPicPr/>
                   </pic:nvPicPr>
-                  <pic:blipFill rotWithShape="1">
-                    <a:blip r:embed="rId16"/>
-                    <a:srcRect b="11761"/>
-                    <a:stretch/>
+                  <pic:blipFill>
+                    <a:blip xmlns:r="http://schemas.openxmlformats.org/officeDocument/2006/relationships" r:embed="rId756918631">
+                      <a:extLst>
+                        <a:ext xmlns:a="http://schemas.openxmlformats.org/drawingml/2006/main" uri="{28A0092B-C50C-407E-A947-70E740481C1C}">
+                          <a14:useLocalDpi xmlns:a14="http://schemas.microsoft.com/office/drawing/2010/main" val="0"/>
+                        </a:ext>
+                      </a:extLst>
+                    </a:blip>
+                    <a:stretch>
+                      <a:fillRect/>
+                    </a:stretch>
                   </pic:blipFill>
-                  <pic:spPr bwMode="auto">
+                  <pic:spPr>
                     <a:xfrm>
                       <a:off x="0" y="0"/>
-                      <a:ext cx="5656580" cy="2225040"/>
+                      <a:ext cx="5724525" cy="485775"/>
                     </a:xfrm>
                     <a:prstGeom prst="rect">
                       <a:avLst/>
                     </a:prstGeom>
-                    <a:ln>
-                      <a:noFill/>
-                    </a:ln>
-                    <a:extLst>
-                      <a:ext uri="{53640926-AAD7-44D8-BBD7-CCE9431645EC}">
-                        <a14:shadowObscured xmlns:a14="http://schemas.microsoft.com/office/drawing/2010/main"/>
-                      </a:ext>
-                    </a:extLst>
                   </pic:spPr>
                 </pic:pic>
               </a:graphicData>
@@ -3365,59 +3600,6 @@
     </w:p>
     <w:p>
       <w:pPr>
-        <w:pStyle w:val="Heading3"/>
-        <w:jc w:val="both"/>
-        <w:rPr>
-          <w:szCs w:val="24"/>
-          <w:lang w:val="en-US"/>
-        </w:rPr>
-      </w:pPr>
-      <w:r>
-        <w:rPr>
-          <w:lang w:val="en-US"/>
-        </w:rPr>
-        <w:t>5.</w:t>
-      </w:r>
-      <w:r>
-        <w:rPr>
-          <w:lang w:val="en-US"/>
-        </w:rPr>
-        <w:t>1.</w:t>
-      </w:r>
-      <w:r>
-        <w:rPr>
-          <w:lang w:val="en-US"/>
-        </w:rPr>
-        <w:t xml:space="preserve">4. </w:t>
-      </w:r>
-      <w:r>
-        <w:rPr>
-          <w:lang w:val="en-US"/>
-        </w:rPr>
-        <w:t>Check that each cell indicates that the library or program ha</w:t>
-      </w:r>
-      <w:r>
-        <w:rPr>
-          <w:lang w:val="en-US"/>
-        </w:rPr>
-        <w:t>s</w:t>
-      </w:r>
-      <w:r>
-        <w:rPr>
-          <w:lang w:val="en-US"/>
-        </w:rPr>
-        <w:t xml:space="preserve"> been installed </w:t>
-      </w:r>
-      <w:r>
-        <w:rPr>
-          <w:szCs w:val="24"/>
-          <w:lang w:val="en-US"/>
-        </w:rPr>
-        <w:t>correctly.</w:t>
-      </w:r>
-    </w:p>
-    <w:p>
-      <w:pPr>
         <w:jc w:val="both"/>
         <w:rPr>
           <w:sz w:val="24"/>
@@ -3435,17 +3617,11 @@
       </w:r>
       <w:r>
         <w:rPr>
-          <w:lang w:val="en-US"/>
-        </w:rPr>
-        <w:t>1.</w:t>
-      </w:r>
-      <w:r>
-        <w:rPr>
           <w:sz w:val="24"/>
           <w:szCs w:val="24"/>
           <w:lang w:val="en-US"/>
         </w:rPr>
-        <w:t xml:space="preserve">5. Close </w:t>
+        <w:t>3</w:t>
       </w:r>
       <w:r>
         <w:rPr>
@@ -3453,16 +3629,15 @@
           <w:szCs w:val="24"/>
           <w:lang w:val="en-US"/>
         </w:rPr>
-        <w:t>the “</w:t>
-      </w:r>
-      <w:proofErr w:type="spellStart"/>
+        <w:t xml:space="preserve">. Close </w:t>
+      </w:r>
       <w:r>
         <w:rPr>
           <w:sz w:val="24"/>
           <w:szCs w:val="24"/>
           <w:lang w:val="en-US"/>
         </w:rPr>
-        <w:t>cheminf</w:t>
+        <w:t>the “</w:t>
       </w:r>
       <w:r>
         <w:rPr>
@@ -3470,34 +3645,31 @@
           <w:szCs w:val="24"/>
           <w:lang w:val="en-US"/>
         </w:rPr>
-        <w:t>_setup.ipynb</w:t>
-      </w:r>
-      <w:proofErr w:type="spellEnd"/>
+        <w:t>che</w:t>
+      </w:r>
       <w:r>
         <w:rPr>
           <w:sz w:val="24"/>
           <w:szCs w:val="24"/>
           <w:lang w:val="en-US"/>
         </w:rPr>
-        <w:t xml:space="preserve">” </w:t>
-      </w:r>
-      <w:proofErr w:type="spellStart"/>
+        <w:t>ck_workshop_envs</w:t>
+      </w:r>
       <w:r>
         <w:rPr>
           <w:sz w:val="24"/>
           <w:szCs w:val="24"/>
           <w:lang w:val="en-US"/>
         </w:rPr>
-        <w:t>Jupyter</w:t>
-      </w:r>
-      <w:proofErr w:type="spellEnd"/>
+        <w:t>.</w:t>
+      </w:r>
       <w:r>
         <w:rPr>
           <w:sz w:val="24"/>
           <w:szCs w:val="24"/>
           <w:lang w:val="en-US"/>
         </w:rPr>
-        <w:t xml:space="preserve"> Notebook and, then, close </w:t>
+        <w:t>ipynb</w:t>
       </w:r>
       <w:r>
         <w:rPr>
@@ -3505,544 +3677,31 @@
           <w:szCs w:val="24"/>
           <w:lang w:val="en-US"/>
         </w:rPr>
-        <w:t>VSC.</w:t>
-      </w:r>
-    </w:p>
-    <w:p>
-      <w:pPr>
-        <w:jc w:val="both"/>
+        <w:t xml:space="preserve">” </w:t>
+      </w:r>
+      <w:r>
         <w:rPr>
           <w:sz w:val="24"/>
           <w:szCs w:val="24"/>
           <w:lang w:val="en-US"/>
         </w:rPr>
-      </w:pPr>
-    </w:p>
-    <w:p>
-      <w:pPr>
-        <w:pStyle w:val="Heading3"/>
-        <w:jc w:val="both"/>
-        <w:rPr>
-          <w:u w:val="single"/>
-          <w:lang w:val="en-US"/>
-        </w:rPr>
-      </w:pPr>
-      <w:r>
-        <w:rPr>
-          <w:u w:val="single"/>
-          <w:lang w:val="en-US"/>
-        </w:rPr>
-        <w:t xml:space="preserve">5.2. </w:t>
-      </w:r>
-      <w:proofErr w:type="spellStart"/>
-      <w:r>
-        <w:rPr>
-          <w:u w:val="single"/>
-          <w:lang w:val="en-US"/>
-        </w:rPr>
-        <w:t>bayesian</w:t>
-      </w:r>
-      <w:proofErr w:type="spellEnd"/>
-      <w:r>
-        <w:rPr>
-          <w:u w:val="single"/>
-          <w:lang w:val="en-US"/>
-        </w:rPr>
-        <w:t xml:space="preserve"> environment</w:t>
-      </w:r>
-    </w:p>
-    <w:p>
-      <w:pPr>
-        <w:pStyle w:val="Heading3"/>
-        <w:jc w:val="both"/>
-        <w:rPr>
-          <w:lang w:val="en-US"/>
-        </w:rPr>
-      </w:pPr>
-      <w:r>
-        <w:rPr>
-          <w:lang w:val="en-US"/>
-        </w:rPr>
-        <w:t>5.</w:t>
-      </w:r>
-      <w:r>
-        <w:rPr>
-          <w:lang w:val="en-US"/>
-        </w:rPr>
-        <w:t>2</w:t>
-      </w:r>
-      <w:r>
-        <w:rPr>
-          <w:lang w:val="en-US"/>
-        </w:rPr>
-        <w:t>.</w:t>
-      </w:r>
-      <w:r>
-        <w:rPr>
-          <w:lang w:val="en-US"/>
-        </w:rPr>
-        <w:t>1.</w:t>
-      </w:r>
-      <w:r>
-        <w:rPr>
-          <w:lang w:val="en-US"/>
-        </w:rPr>
-        <w:t xml:space="preserve"> </w:t>
-      </w:r>
-      <w:r>
-        <w:rPr>
-          <w:lang w:val="en-US"/>
-        </w:rPr>
-        <w:t>Open, using VSC, the “</w:t>
-      </w:r>
-      <w:proofErr w:type="spellStart"/>
-      <w:r>
-        <w:rPr>
-          <w:lang w:val="en-US"/>
-        </w:rPr>
-        <w:t>bayesian</w:t>
-      </w:r>
-      <w:r>
-        <w:rPr>
-          <w:lang w:val="en-US"/>
-        </w:rPr>
-        <w:t>_setup.ipynb</w:t>
-      </w:r>
-      <w:proofErr w:type="spellEnd"/>
-      <w:r>
-        <w:rPr>
-          <w:lang w:val="en-US"/>
-        </w:rPr>
-        <w:t xml:space="preserve">” </w:t>
-      </w:r>
-      <w:proofErr w:type="spellStart"/>
-      <w:r>
-        <w:rPr>
-          <w:lang w:val="en-US"/>
-        </w:rPr>
         <w:t>Jupyter</w:t>
       </w:r>
-      <w:proofErr w:type="spellEnd"/>
-      <w:r>
-        <w:rPr>
-          <w:lang w:val="en-US"/>
-        </w:rPr>
-        <w:t xml:space="preserve"> Notebook unzipped from the previous step</w:t>
-      </w:r>
-      <w:r>
-        <w:rPr>
-          <w:lang w:val="en-US"/>
-        </w:rPr>
-        <w:t xml:space="preserve"> (in the “</w:t>
-      </w:r>
-      <w:r>
-        <w:rPr>
-          <w:lang w:val="en-US"/>
-        </w:rPr>
-        <w:t>ML_course</w:t>
-      </w:r>
-      <w:r>
-        <w:rPr>
-          <w:lang w:val="en-US"/>
-        </w:rPr>
-        <w:t>/</w:t>
-      </w:r>
-      <w:r>
-        <w:rPr>
-          <w:lang w:val="en-US"/>
-        </w:rPr>
-        <w:t>Prerequisites</w:t>
-      </w:r>
-      <w:r>
-        <w:rPr>
-          <w:lang w:val="en-US"/>
-        </w:rPr>
-        <w:t>/</w:t>
-      </w:r>
-      <w:proofErr w:type="spellStart"/>
-      <w:r>
-        <w:rPr>
-          <w:lang w:val="en-US"/>
-        </w:rPr>
-        <w:t>Setup_and_testing</w:t>
-      </w:r>
-      <w:proofErr w:type="spellEnd"/>
-      <w:r>
-        <w:rPr>
-          <w:lang w:val="en-US"/>
-        </w:rPr>
-        <w:t>” folder)</w:t>
-      </w:r>
-      <w:r>
-        <w:rPr>
-          <w:lang w:val="en-US"/>
-        </w:rPr>
-        <w:t>.</w:t>
-      </w:r>
-    </w:p>
-    <w:p>
-      <w:pPr>
-        <w:pStyle w:val="Heading3"/>
-        <w:jc w:val="both"/>
-        <w:rPr>
-          <w:lang w:val="en-US"/>
-        </w:rPr>
-      </w:pPr>
-      <w:r>
-        <w:rPr>
-          <w:lang w:val="en-US"/>
-        </w:rPr>
-        <w:t>5.</w:t>
-      </w:r>
-      <w:r>
-        <w:rPr>
-          <w:lang w:val="en-US"/>
-        </w:rPr>
-        <w:t>2.2.</w:t>
-      </w:r>
-      <w:r>
-        <w:rPr>
-          <w:lang w:val="en-US"/>
-        </w:rPr>
-        <w:t xml:space="preserve"> </w:t>
-      </w:r>
-      <w:r>
-        <w:rPr>
-          <w:lang w:val="en-US"/>
-        </w:rPr>
-        <w:t xml:space="preserve">When VSC opens, select the </w:t>
-      </w:r>
-      <w:proofErr w:type="spellStart"/>
-      <w:r>
-        <w:rPr>
-          <w:lang w:val="en-US"/>
-        </w:rPr>
-        <w:t>bayesian</w:t>
-      </w:r>
-      <w:proofErr w:type="spellEnd"/>
-      <w:r>
-        <w:rPr>
-          <w:lang w:val="en-US"/>
-        </w:rPr>
-        <w:t xml:space="preserve"> </w:t>
-      </w:r>
-      <w:r>
-        <w:rPr>
-          <w:lang w:val="en-US"/>
-        </w:rPr>
-        <w:t>kernel</w:t>
-      </w:r>
-      <w:r>
-        <w:rPr>
-          <w:lang w:val="en-US"/>
-        </w:rPr>
-        <w:t xml:space="preserve"> (see step 5.</w:t>
-      </w:r>
-      <w:r>
-        <w:rPr>
-          <w:lang w:val="en-US"/>
-        </w:rPr>
-        <w:t>1.</w:t>
-      </w:r>
-      <w:r>
-        <w:rPr>
-          <w:lang w:val="en-US"/>
-        </w:rPr>
-        <w:t xml:space="preserve">2, but this time with </w:t>
-      </w:r>
-      <w:r>
-        <w:rPr>
-          <w:lang w:val="en-US"/>
-        </w:rPr>
-        <w:t>“</w:t>
-      </w:r>
-      <w:proofErr w:type="spellStart"/>
-      <w:r>
-        <w:rPr>
-          <w:lang w:val="en-US"/>
-        </w:rPr>
-        <w:t>bayesian</w:t>
-      </w:r>
-      <w:proofErr w:type="spellEnd"/>
-      <w:r>
-        <w:rPr>
-          <w:lang w:val="en-US"/>
-        </w:rPr>
-        <w:t>”</w:t>
-      </w:r>
-      <w:r>
-        <w:rPr>
-          <w:lang w:val="en-US"/>
-        </w:rPr>
-        <w:t>)</w:t>
-      </w:r>
-    </w:p>
-    <w:p>
-      <w:pPr>
-        <w:pStyle w:val="Heading3"/>
-        <w:jc w:val="both"/>
-        <w:rPr>
-          <w:i/>
-          <w:iCs/>
-          <w:lang w:val="en-US"/>
-        </w:rPr>
-      </w:pPr>
-      <w:r>
-        <w:rPr>
-          <w:lang w:val="en-US"/>
-        </w:rPr>
-        <w:t>5.</w:t>
-      </w:r>
-      <w:r>
-        <w:rPr>
-          <w:lang w:val="en-US"/>
-        </w:rPr>
-        <w:t>2.3.</w:t>
-      </w:r>
-      <w:r>
-        <w:rPr>
-          <w:lang w:val="en-US"/>
-        </w:rPr>
-        <w:t xml:space="preserve"> </w:t>
-      </w:r>
-      <w:r>
-        <w:rPr>
-          <w:lang w:val="en-US"/>
-        </w:rPr>
-        <w:t xml:space="preserve">Run </w:t>
-      </w:r>
-      <w:r>
-        <w:rPr>
-          <w:lang w:val="en-US"/>
-        </w:rPr>
-        <w:t>the</w:t>
-      </w:r>
-      <w:r>
-        <w:rPr>
-          <w:lang w:val="en-US"/>
-        </w:rPr>
-        <w:t xml:space="preserve"> </w:t>
-      </w:r>
-      <w:r>
-        <w:rPr>
-          <w:lang w:val="en-US"/>
-        </w:rPr>
-        <w:t xml:space="preserve">code </w:t>
-      </w:r>
-      <w:r>
-        <w:rPr>
-          <w:lang w:val="en-US"/>
-        </w:rPr>
-        <w:t>cell</w:t>
-      </w:r>
-      <w:r>
-        <w:rPr>
-          <w:lang w:val="en-US"/>
-        </w:rPr>
-        <w:t>s</w:t>
-      </w:r>
-      <w:r>
-        <w:rPr>
-          <w:lang w:val="en-US"/>
-        </w:rPr>
-        <w:t xml:space="preserve"> by </w:t>
-      </w:r>
-      <w:r>
-        <w:rPr>
-          <w:lang w:val="en-US"/>
-        </w:rPr>
-        <w:t xml:space="preserve">clicking “Run All”, </w:t>
-      </w:r>
-      <w:r>
-        <w:rPr>
-          <w:lang w:val="en-US"/>
-        </w:rPr>
-        <w:t>placing the cursor on each cell an</w:t>
-      </w:r>
-      <w:r>
-        <w:rPr>
-          <w:lang w:val="en-US"/>
-        </w:rPr>
-        <w:t>d</w:t>
-      </w:r>
-      <w:r>
-        <w:rPr>
-          <w:lang w:val="en-US"/>
-        </w:rPr>
-        <w:t xml:space="preserve"> pressing the play button</w:t>
-      </w:r>
-      <w:r>
-        <w:rPr>
-          <w:lang w:val="en-US"/>
-        </w:rPr>
-        <w:t>,</w:t>
-      </w:r>
-      <w:r>
-        <w:rPr>
-          <w:lang w:val="en-US"/>
-        </w:rPr>
-        <w:t xml:space="preserve"> or</w:t>
-      </w:r>
-      <w:r>
-        <w:rPr>
-          <w:lang w:val="en-US"/>
-        </w:rPr>
-        <w:t xml:space="preserve"> pressing</w:t>
-      </w:r>
-      <w:r>
-        <w:rPr>
-          <w:lang w:val="en-US"/>
-        </w:rPr>
-        <w:t xml:space="preserve"> </w:t>
-      </w:r>
-      <w:r>
-        <w:rPr>
-          <w:i/>
-          <w:iCs/>
-          <w:lang w:val="en-US"/>
-        </w:rPr>
-        <w:t xml:space="preserve">Shift </w:t>
-      </w:r>
-      <w:r>
-        <w:rPr>
-          <w:lang w:val="en-US"/>
-        </w:rPr>
-        <w:t xml:space="preserve">+ </w:t>
-      </w:r>
-      <w:r>
-        <w:rPr>
-          <w:i/>
-          <w:iCs/>
-          <w:lang w:val="en-US"/>
-        </w:rPr>
-        <w:t>Enter</w:t>
-      </w:r>
-      <w:r>
-        <w:rPr>
-          <w:i/>
-          <w:iCs/>
-          <w:lang w:val="en-US"/>
-        </w:rPr>
-        <w:t xml:space="preserve"> </w:t>
-      </w:r>
-      <w:r>
-        <w:rPr>
-          <w:lang w:val="en-US"/>
-        </w:rPr>
-        <w:t>(see step 5.</w:t>
-      </w:r>
-      <w:r>
-        <w:rPr>
-          <w:lang w:val="en-US"/>
-        </w:rPr>
-        <w:t>1.</w:t>
-      </w:r>
-      <w:r>
-        <w:rPr>
-          <w:lang w:val="en-US"/>
-        </w:rPr>
-        <w:t>3)</w:t>
-      </w:r>
-    </w:p>
-    <w:p>
-      <w:pPr>
-        <w:pStyle w:val="Heading3"/>
-        <w:jc w:val="both"/>
-        <w:rPr>
-          <w:lang w:val="en-GB"/>
-        </w:rPr>
-      </w:pPr>
-      <w:r>
-        <w:rPr>
-          <w:lang w:val="en-US"/>
-        </w:rPr>
-        <w:t>5.</w:t>
-      </w:r>
-      <w:r>
-        <w:rPr>
-          <w:lang w:val="en-US"/>
-        </w:rPr>
-        <w:t>2.4.</w:t>
-      </w:r>
-      <w:r>
-        <w:rPr>
-          <w:lang w:val="en-US"/>
-        </w:rPr>
-        <w:t xml:space="preserve"> </w:t>
-      </w:r>
-      <w:r>
-        <w:rPr>
-          <w:lang w:val="en-US"/>
-        </w:rPr>
-        <w:t>Check that each cell indicates that the library or program ha</w:t>
-      </w:r>
-      <w:r>
-        <w:rPr>
-          <w:lang w:val="en-US"/>
-        </w:rPr>
-        <w:t>s</w:t>
-      </w:r>
-      <w:r>
-        <w:rPr>
-          <w:lang w:val="en-US"/>
-        </w:rPr>
-        <w:t xml:space="preserve"> been installed correctly</w:t>
-      </w:r>
-      <w:r>
-        <w:rPr>
-          <w:lang w:val="en-US"/>
-        </w:rPr>
-        <w:t xml:space="preserve"> (or does not show </w:t>
-      </w:r>
-      <w:r>
-        <w:rPr>
-          <w:lang w:val="en-US"/>
-        </w:rPr>
-        <w:t>“</w:t>
-      </w:r>
-      <w:proofErr w:type="spellStart"/>
-      <w:r>
-        <w:rPr>
-          <w:lang w:val="en-GB"/>
-        </w:rPr>
-        <w:t>ModuleNotFoundError</w:t>
-      </w:r>
-      <w:proofErr w:type="spellEnd"/>
-      <w:r>
-        <w:rPr>
-          <w:lang w:val="en-GB"/>
-        </w:rPr>
-        <w:t>”)</w:t>
-      </w:r>
-      <w:r>
-        <w:rPr>
-          <w:lang w:val="en-US"/>
-        </w:rPr>
-        <w:t>.</w:t>
-      </w:r>
-    </w:p>
-    <w:p>
-      <w:pPr>
-        <w:jc w:val="both"/>
+      <w:r>
         <w:rPr>
           <w:sz w:val="24"/>
           <w:szCs w:val="24"/>
           <w:lang w:val="en-US"/>
         </w:rPr>
-      </w:pPr>
+        <w:t xml:space="preserve"> Notebook </w:t>
+      </w:r>
       <w:r>
         <w:rPr>
           <w:sz w:val="24"/>
           <w:szCs w:val="24"/>
           <w:lang w:val="en-US"/>
         </w:rPr>
-        <w:t>5.</w:t>
-      </w:r>
-      <w:r>
-        <w:rPr>
-          <w:lang w:val="en-US"/>
-        </w:rPr>
-        <w:t>2.</w:t>
+        <w:t>and,</w:t>
       </w:r>
       <w:r>
         <w:rPr>
@@ -4050,61 +3709,25 @@
           <w:szCs w:val="24"/>
           <w:lang w:val="en-US"/>
         </w:rPr>
-        <w:t>5. Close the “</w:t>
-      </w:r>
-      <w:proofErr w:type="spellStart"/>
+        <w:t xml:space="preserve"> then, close </w:t>
+      </w:r>
       <w:r>
         <w:rPr>
           <w:sz w:val="24"/>
           <w:szCs w:val="24"/>
           <w:lang w:val="en-US"/>
         </w:rPr>
-        <w:t>bayesian</w:t>
-      </w:r>
-      <w:r>
+        <w:t>VSC.</w:t>
+      </w:r>
+    </w:p>
+    <w:p>
+      <w:pPr>
+        <w:jc w:val="both"/>
         <w:rPr>
           <w:sz w:val="24"/>
           <w:szCs w:val="24"/>
           <w:lang w:val="en-US"/>
         </w:rPr>
-        <w:t>_setup.ipynb</w:t>
-      </w:r>
-      <w:proofErr w:type="spellEnd"/>
-      <w:r>
-        <w:rPr>
-          <w:sz w:val="24"/>
-          <w:szCs w:val="24"/>
-          <w:lang w:val="en-US"/>
-        </w:rPr>
-        <w:t xml:space="preserve">” </w:t>
-      </w:r>
-      <w:proofErr w:type="spellStart"/>
-      <w:r>
-        <w:rPr>
-          <w:sz w:val="24"/>
-          <w:szCs w:val="24"/>
-          <w:lang w:val="en-US"/>
-        </w:rPr>
-        <w:t>Jupyter</w:t>
-      </w:r>
-      <w:proofErr w:type="spellEnd"/>
-      <w:r>
-        <w:rPr>
-          <w:sz w:val="24"/>
-          <w:szCs w:val="24"/>
-          <w:lang w:val="en-US"/>
-        </w:rPr>
-        <w:t xml:space="preserve"> Notebook and, then, close VSC.</w:t>
-      </w:r>
-    </w:p>
-    <w:p>
-      <w:pPr>
-        <w:jc w:val="both"/>
-        <w:rPr>
-          <w:sz w:val="24"/>
-          <w:szCs w:val="24"/>
-          <w:lang w:val="en-US"/>
-        </w:rPr>
       </w:pPr>
     </w:p>
     <w:p>
@@ -4245,7 +3868,6 @@
         <w:rPr>
           <w:lang w:val="en-US"/>
         </w:rPr>
-        <w:lastRenderedPageBreak/>
         <w:t xml:space="preserve">If when opening a CSV file everything is condensed into a single column, you can change this in </w:t>
       </w:r>
       <w:r>
@@ -4284,11 +3906,12 @@
       </w:r>
       <w:r>
         <w:rPr>
+          <w:rFonts w:ascii="Wingdings" w:hAnsi="Wingdings" w:eastAsia="Wingdings" w:cs="Wingdings"/>
           <w:b/>
           <w:bCs/>
           <w:lang w:val="en-US"/>
         </w:rPr>
-        <w:sym w:font="Wingdings" w:char="F0E0"/>
+        <w:t>à</w:t>
       </w:r>
       <w:r>
         <w:rPr>
@@ -4300,11 +3923,12 @@
       </w:r>
       <w:r>
         <w:rPr>
+          <w:rFonts w:ascii="Wingdings" w:hAnsi="Wingdings" w:eastAsia="Wingdings" w:cs="Wingdings"/>
           <w:b/>
           <w:bCs/>
           <w:lang w:val="en-US"/>
         </w:rPr>
-        <w:sym w:font="Wingdings" w:char="F0E0"/>
+        <w:t>à</w:t>
       </w:r>
       <w:r>
         <w:rPr>
@@ -4412,7 +4036,7 @@
           <w:lang w:val="en-US"/>
         </w:rPr>
       </w:pPr>
-      <w:hyperlink r:id="rId17" w:history="1">
+      <w:hyperlink w:history="1" r:id="rId17">
         <w:r>
           <w:rPr>
             <w:rStyle w:val="Hyperlink"/>
@@ -4530,7 +4154,7 @@
           <w:lang w:val="en-US"/>
         </w:rPr>
       </w:pPr>
-      <w:hyperlink r:id="rId18" w:history="1">
+      <w:hyperlink w:history="1" r:id="rId18">
         <w:r>
           <w:rPr>
             <w:rStyle w:val="Hyperlink"/>
@@ -4827,7 +4451,6 @@
         <w:rPr>
           <w:lang w:val="en-US"/>
         </w:rPr>
-        <w:lastRenderedPageBreak/>
         <w:t>A brief description of what happens</w:t>
       </w:r>
     </w:p>
@@ -4963,7 +4586,7 @@
           <w:lang w:val="en-US"/>
         </w:rPr>
       </w:pPr>
-      <w:hyperlink r:id="rId19" w:history="1">
+      <w:hyperlink w:history="1" r:id="rId19">
         <w:r>
           <w:rPr>
             <w:rStyle w:val="Hyperlink"/>
@@ -5094,7 +4717,7 @@
         <w:ind w:left="0"/>
         <w:jc w:val="both"/>
         <w:rPr>
-          <w:rFonts w:ascii="Courier New" w:eastAsia="Courier New" w:hAnsi="Courier New"/>
+          <w:rFonts w:ascii="Courier New" w:hAnsi="Courier New" w:eastAsia="Courier New"/>
           <w:sz w:val="20"/>
           <w:lang w:val="en-US"/>
         </w:rPr>
@@ -5114,7 +4737,7 @@
       <w:proofErr w:type="spellStart"/>
       <w:r>
         <w:rPr>
-          <w:rFonts w:ascii="Courier New" w:eastAsia="Courier New" w:hAnsi="Courier New"/>
+          <w:rFonts w:ascii="Courier New" w:hAnsi="Courier New" w:eastAsia="Courier New"/>
           <w:sz w:val="20"/>
           <w:lang w:val="en-US"/>
         </w:rPr>
@@ -5123,7 +4746,7 @@
       <w:proofErr w:type="spellEnd"/>
       <w:r>
         <w:rPr>
-          <w:rFonts w:ascii="Courier New" w:eastAsia="Courier New" w:hAnsi="Courier New"/>
+          <w:rFonts w:ascii="Courier New" w:hAnsi="Courier New" w:eastAsia="Courier New"/>
           <w:sz w:val="20"/>
           <w:lang w:val="en-US"/>
         </w:rPr>
@@ -5180,14 +4803,14 @@
         <w:ind w:left="0"/>
         <w:jc w:val="both"/>
         <w:rPr>
-          <w:rFonts w:ascii="Courier New" w:eastAsia="Courier New" w:hAnsi="Courier New"/>
+          <w:rFonts w:ascii="Courier New" w:hAnsi="Courier New" w:eastAsia="Courier New"/>
           <w:sz w:val="20"/>
           <w:lang w:val="en-US"/>
         </w:rPr>
       </w:pPr>
       <w:r>
         <w:rPr>
-          <w:rFonts w:ascii="Courier New" w:eastAsia="Courier New" w:hAnsi="Courier New"/>
+          <w:rFonts w:ascii="Courier New" w:hAnsi="Courier New" w:eastAsia="Courier New"/>
           <w:sz w:val="20"/>
           <w:lang w:val="en-US"/>
         </w:rPr>
@@ -5559,7 +5182,6 @@
         <w:rPr>
           <w:lang w:val="en-US"/>
         </w:rPr>
-        <w:lastRenderedPageBreak/>
         <w:t xml:space="preserve">Open </w:t>
       </w:r>
       <w:r>
@@ -5757,7 +5379,7 @@
       <w:proofErr w:type="spellStart"/>
       <w:r>
         <w:rPr>
-          <w:rFonts w:ascii="Courier New" w:eastAsia="Courier New" w:hAnsi="Courier New"/>
+          <w:rFonts w:ascii="Courier New" w:hAnsi="Courier New" w:eastAsia="Courier New"/>
           <w:sz w:val="20"/>
           <w:lang w:val="en-US"/>
         </w:rPr>
@@ -5766,7 +5388,7 @@
       <w:proofErr w:type="spellEnd"/>
       <w:r>
         <w:rPr>
-          <w:rFonts w:ascii="Courier New" w:eastAsia="Courier New" w:hAnsi="Courier New"/>
+          <w:rFonts w:ascii="Courier New" w:hAnsi="Courier New" w:eastAsia="Courier New"/>
           <w:sz w:val="20"/>
           <w:lang w:val="en-US"/>
         </w:rPr>
@@ -5775,7 +5397,7 @@
       <w:proofErr w:type="spellStart"/>
       <w:r>
         <w:rPr>
-          <w:rFonts w:ascii="Courier New" w:eastAsia="Courier New" w:hAnsi="Courier New"/>
+          <w:rFonts w:ascii="Courier New" w:hAnsi="Courier New" w:eastAsia="Courier New"/>
           <w:sz w:val="20"/>
           <w:lang w:val="en-US"/>
         </w:rPr>
@@ -5847,7 +5469,7 @@
           <w:lang w:val="en-US"/>
         </w:rPr>
       </w:pPr>
-      <w:hyperlink r:id="rId20" w:history="1">
+      <w:hyperlink w:history="1" r:id="rId20">
         <w:r>
           <w:rPr>
             <w:rStyle w:val="Hyperlink"/>
@@ -6022,14 +5644,14 @@
         <w:ind w:left="0"/>
         <w:jc w:val="both"/>
         <w:rPr>
-          <w:rFonts w:ascii="Courier New" w:eastAsia="Courier New" w:hAnsi="Courier New"/>
+          <w:rFonts w:ascii="Courier New" w:hAnsi="Courier New" w:eastAsia="Courier New"/>
           <w:sz w:val="20"/>
           <w:lang w:val="en-US"/>
         </w:rPr>
       </w:pPr>
       <w:r>
         <w:rPr>
-          <w:rFonts w:ascii="Courier New" w:eastAsia="Courier New" w:hAnsi="Courier New"/>
+          <w:rFonts w:ascii="Courier New" w:hAnsi="Courier New" w:eastAsia="Courier New"/>
           <w:sz w:val="20"/>
           <w:lang w:val="en-US"/>
         </w:rPr>
@@ -6042,7 +5664,7 @@
         <w:ind w:left="0"/>
         <w:jc w:val="both"/>
         <w:rPr>
-          <w:rFonts w:ascii="Courier New" w:eastAsia="Courier New" w:hAnsi="Courier New"/>
+          <w:rFonts w:ascii="Courier New" w:hAnsi="Courier New" w:eastAsia="Courier New"/>
           <w:sz w:val="20"/>
           <w:lang w:val="en-US"/>
         </w:rPr>
@@ -6106,7 +5728,7 @@
         <w:ind w:left="0"/>
         <w:jc w:val="both"/>
         <w:rPr>
-          <w:rFonts w:ascii="Courier New" w:eastAsia="Courier New" w:hAnsi="Courier New"/>
+          <w:rFonts w:ascii="Courier New" w:hAnsi="Courier New" w:eastAsia="Courier New"/>
           <w:sz w:val="20"/>
           <w:lang w:val="en-US"/>
         </w:rPr>
@@ -6119,14 +5741,14 @@
         <w:ind w:left="0"/>
         <w:jc w:val="both"/>
         <w:rPr>
-          <w:rFonts w:ascii="Courier New" w:eastAsia="Courier New" w:hAnsi="Courier New"/>
+          <w:rFonts w:ascii="Courier New" w:hAnsi="Courier New" w:eastAsia="Courier New"/>
           <w:sz w:val="20"/>
           <w:lang w:val="en-US"/>
         </w:rPr>
       </w:pPr>
       <w:r>
         <w:rPr>
-          <w:rFonts w:ascii="Courier New" w:eastAsia="Courier New" w:hAnsi="Courier New"/>
+          <w:rFonts w:ascii="Courier New" w:hAnsi="Courier New" w:eastAsia="Courier New"/>
           <w:sz w:val="20"/>
           <w:lang w:val="en-US"/>
         </w:rPr>
@@ -6134,7 +5756,7 @@
       </w:r>
     </w:p>
     <w:sectPr>
-      <w:pgSz w:w="11906" w:h="16838"/>
+      <w:pgSz w:w="11906" w:h="16838" w:orient="portrait"/>
       <w:pgMar w:top="1440" w:right="1440" w:bottom="1440" w:left="1440" w:header="708" w:footer="708" w:gutter="0"/>
       <w:cols w:space="708"/>
       <w:docGrid w:linePitch="360"/>
@@ -7161,7 +6783,7 @@
         <w:ind w:left="1080" w:hanging="360"/>
       </w:pPr>
       <w:rPr>
-        <w:rFonts w:ascii="Symbol" w:hAnsi="Symbol" w:hint="default"/>
+        <w:rFonts w:hint="default" w:ascii="Symbol" w:hAnsi="Symbol"/>
       </w:rPr>
     </w:lvl>
     <w:lvl w:ilvl="1" w:tplc="0C0A0003" w:tentative="1">
@@ -7173,7 +6795,7 @@
         <w:ind w:left="1800" w:hanging="360"/>
       </w:pPr>
       <w:rPr>
-        <w:rFonts w:ascii="Courier New" w:hAnsi="Courier New" w:cs="Courier New" w:hint="default"/>
+        <w:rFonts w:hint="default" w:ascii="Courier New" w:hAnsi="Courier New" w:cs="Courier New"/>
       </w:rPr>
     </w:lvl>
     <w:lvl w:ilvl="2" w:tplc="0C0A0005" w:tentative="1">
@@ -7185,7 +6807,7 @@
         <w:ind w:left="2520" w:hanging="360"/>
       </w:pPr>
       <w:rPr>
-        <w:rFonts w:ascii="Wingdings" w:hAnsi="Wingdings" w:hint="default"/>
+        <w:rFonts w:hint="default" w:ascii="Wingdings" w:hAnsi="Wingdings"/>
       </w:rPr>
     </w:lvl>
     <w:lvl w:ilvl="3" w:tplc="0C0A0001" w:tentative="1">
@@ -7197,7 +6819,7 @@
         <w:ind w:left="3240" w:hanging="360"/>
       </w:pPr>
       <w:rPr>
-        <w:rFonts w:ascii="Symbol" w:hAnsi="Symbol" w:hint="default"/>
+        <w:rFonts w:hint="default" w:ascii="Symbol" w:hAnsi="Symbol"/>
       </w:rPr>
     </w:lvl>
     <w:lvl w:ilvl="4" w:tplc="0C0A0003" w:tentative="1">
@@ -7209,7 +6831,7 @@
         <w:ind w:left="3960" w:hanging="360"/>
       </w:pPr>
       <w:rPr>
-        <w:rFonts w:ascii="Courier New" w:hAnsi="Courier New" w:cs="Courier New" w:hint="default"/>
+        <w:rFonts w:hint="default" w:ascii="Courier New" w:hAnsi="Courier New" w:cs="Courier New"/>
       </w:rPr>
     </w:lvl>
     <w:lvl w:ilvl="5" w:tplc="0C0A0005" w:tentative="1">
@@ -7221,7 +6843,7 @@
         <w:ind w:left="4680" w:hanging="360"/>
       </w:pPr>
       <w:rPr>
-        <w:rFonts w:ascii="Wingdings" w:hAnsi="Wingdings" w:hint="default"/>
+        <w:rFonts w:hint="default" w:ascii="Wingdings" w:hAnsi="Wingdings"/>
       </w:rPr>
     </w:lvl>
     <w:lvl w:ilvl="6" w:tplc="0C0A0001" w:tentative="1">
@@ -7233,7 +6855,7 @@
         <w:ind w:left="5400" w:hanging="360"/>
       </w:pPr>
       <w:rPr>
-        <w:rFonts w:ascii="Symbol" w:hAnsi="Symbol" w:hint="default"/>
+        <w:rFonts w:hint="default" w:ascii="Symbol" w:hAnsi="Symbol"/>
       </w:rPr>
     </w:lvl>
     <w:lvl w:ilvl="7" w:tplc="0C0A0003" w:tentative="1">
@@ -7245,7 +6867,7 @@
         <w:ind w:left="6120" w:hanging="360"/>
       </w:pPr>
       <w:rPr>
-        <w:rFonts w:ascii="Courier New" w:hAnsi="Courier New" w:cs="Courier New" w:hint="default"/>
+        <w:rFonts w:hint="default" w:ascii="Courier New" w:hAnsi="Courier New" w:cs="Courier New"/>
       </w:rPr>
     </w:lvl>
     <w:lvl w:ilvl="8" w:tplc="0C0A0005" w:tentative="1">
@@ -7257,7 +6879,7 @@
         <w:ind w:left="6840" w:hanging="360"/>
       </w:pPr>
       <w:rPr>
-        <w:rFonts w:ascii="Wingdings" w:hAnsi="Wingdings" w:hint="default"/>
+        <w:rFonts w:hint="default" w:ascii="Wingdings" w:hAnsi="Wingdings"/>
       </w:rPr>
     </w:lvl>
   </w:abstractNum>
@@ -7655,7 +7277,7 @@
         <w:ind w:left="720" w:hanging="360"/>
       </w:pPr>
       <w:rPr>
-        <w:rFonts w:ascii="Times New Roman" w:eastAsiaTheme="minorHAnsi" w:hAnsi="Times New Roman" w:cs="Times New Roman" w:hint="default"/>
+        <w:rFonts w:hint="default" w:ascii="Times New Roman" w:hAnsi="Times New Roman" w:cs="Times New Roman" w:eastAsiaTheme="minorHAnsi"/>
       </w:rPr>
     </w:lvl>
     <w:lvl w:ilvl="1" w:tplc="0C0A0003" w:tentative="1">
@@ -7667,7 +7289,7 @@
         <w:ind w:left="1440" w:hanging="360"/>
       </w:pPr>
       <w:rPr>
-        <w:rFonts w:ascii="Courier New" w:hAnsi="Courier New" w:cs="Courier New" w:hint="default"/>
+        <w:rFonts w:hint="default" w:ascii="Courier New" w:hAnsi="Courier New" w:cs="Courier New"/>
       </w:rPr>
     </w:lvl>
     <w:lvl w:ilvl="2" w:tplc="0C0A0005" w:tentative="1">
@@ -7679,7 +7301,7 @@
         <w:ind w:left="2160" w:hanging="360"/>
       </w:pPr>
       <w:rPr>
-        <w:rFonts w:ascii="Wingdings" w:hAnsi="Wingdings" w:hint="default"/>
+        <w:rFonts w:hint="default" w:ascii="Wingdings" w:hAnsi="Wingdings"/>
       </w:rPr>
     </w:lvl>
     <w:lvl w:ilvl="3" w:tplc="0C0A0001" w:tentative="1">
@@ -7691,7 +7313,7 @@
         <w:ind w:left="2880" w:hanging="360"/>
       </w:pPr>
       <w:rPr>
-        <w:rFonts w:ascii="Symbol" w:hAnsi="Symbol" w:hint="default"/>
+        <w:rFonts w:hint="default" w:ascii="Symbol" w:hAnsi="Symbol"/>
       </w:rPr>
     </w:lvl>
     <w:lvl w:ilvl="4" w:tplc="0C0A0003" w:tentative="1">
@@ -7703,7 +7325,7 @@
         <w:ind w:left="3600" w:hanging="360"/>
       </w:pPr>
       <w:rPr>
-        <w:rFonts w:ascii="Courier New" w:hAnsi="Courier New" w:cs="Courier New" w:hint="default"/>
+        <w:rFonts w:hint="default" w:ascii="Courier New" w:hAnsi="Courier New" w:cs="Courier New"/>
       </w:rPr>
     </w:lvl>
     <w:lvl w:ilvl="5" w:tplc="0C0A0005" w:tentative="1">
@@ -7715,7 +7337,7 @@
         <w:ind w:left="4320" w:hanging="360"/>
       </w:pPr>
       <w:rPr>
-        <w:rFonts w:ascii="Wingdings" w:hAnsi="Wingdings" w:hint="default"/>
+        <w:rFonts w:hint="default" w:ascii="Wingdings" w:hAnsi="Wingdings"/>
       </w:rPr>
     </w:lvl>
     <w:lvl w:ilvl="6" w:tplc="0C0A0001" w:tentative="1">
@@ -7727,7 +7349,7 @@
         <w:ind w:left="5040" w:hanging="360"/>
       </w:pPr>
       <w:rPr>
-        <w:rFonts w:ascii="Symbol" w:hAnsi="Symbol" w:hint="default"/>
+        <w:rFonts w:hint="default" w:ascii="Symbol" w:hAnsi="Symbol"/>
       </w:rPr>
     </w:lvl>
     <w:lvl w:ilvl="7" w:tplc="0C0A0003" w:tentative="1">
@@ -7739,7 +7361,7 @@
         <w:ind w:left="5760" w:hanging="360"/>
       </w:pPr>
       <w:rPr>
-        <w:rFonts w:ascii="Courier New" w:hAnsi="Courier New" w:cs="Courier New" w:hint="default"/>
+        <w:rFonts w:hint="default" w:ascii="Courier New" w:hAnsi="Courier New" w:cs="Courier New"/>
       </w:rPr>
     </w:lvl>
     <w:lvl w:ilvl="8" w:tplc="0C0A0005" w:tentative="1">
@@ -7751,7 +7373,7 @@
         <w:ind w:left="6480" w:hanging="360"/>
       </w:pPr>
       <w:rPr>
-        <w:rFonts w:ascii="Wingdings" w:hAnsi="Wingdings" w:hint="default"/>
+        <w:rFonts w:hint="default" w:ascii="Wingdings" w:hAnsi="Wingdings"/>
       </w:rPr>
     </w:lvl>
   </w:abstractNum>
@@ -8214,7 +7836,7 @@
         <w:ind w:left="720" w:hanging="360"/>
       </w:pPr>
       <w:rPr>
-        <w:rFonts w:ascii="Aptos" w:eastAsiaTheme="minorHAnsi" w:hAnsi="Aptos" w:cstheme="minorBidi" w:hint="default"/>
+        <w:rFonts w:hint="default" w:ascii="Aptos" w:hAnsi="Aptos" w:eastAsiaTheme="minorHAnsi" w:cstheme="minorBidi"/>
       </w:rPr>
     </w:lvl>
     <w:lvl w:ilvl="1" w:tplc="040B0003" w:tentative="1">
@@ -8226,7 +7848,7 @@
         <w:ind w:left="1440" w:hanging="360"/>
       </w:pPr>
       <w:rPr>
-        <w:rFonts w:ascii="Courier New" w:hAnsi="Courier New" w:cs="Courier New" w:hint="default"/>
+        <w:rFonts w:hint="default" w:ascii="Courier New" w:hAnsi="Courier New" w:cs="Courier New"/>
       </w:rPr>
     </w:lvl>
     <w:lvl w:ilvl="2" w:tplc="040B0005" w:tentative="1">
@@ -8238,7 +7860,7 @@
         <w:ind w:left="2160" w:hanging="360"/>
       </w:pPr>
       <w:rPr>
-        <w:rFonts w:ascii="Wingdings" w:hAnsi="Wingdings" w:hint="default"/>
+        <w:rFonts w:hint="default" w:ascii="Wingdings" w:hAnsi="Wingdings"/>
       </w:rPr>
     </w:lvl>
     <w:lvl w:ilvl="3" w:tplc="040B0001" w:tentative="1">
@@ -8250,7 +7872,7 @@
         <w:ind w:left="2880" w:hanging="360"/>
       </w:pPr>
       <w:rPr>
-        <w:rFonts w:ascii="Symbol" w:hAnsi="Symbol" w:hint="default"/>
+        <w:rFonts w:hint="default" w:ascii="Symbol" w:hAnsi="Symbol"/>
       </w:rPr>
     </w:lvl>
     <w:lvl w:ilvl="4" w:tplc="040B0003" w:tentative="1">
@@ -8262,7 +7884,7 @@
         <w:ind w:left="3600" w:hanging="360"/>
       </w:pPr>
       <w:rPr>
-        <w:rFonts w:ascii="Courier New" w:hAnsi="Courier New" w:cs="Courier New" w:hint="default"/>
+        <w:rFonts w:hint="default" w:ascii="Courier New" w:hAnsi="Courier New" w:cs="Courier New"/>
       </w:rPr>
     </w:lvl>
     <w:lvl w:ilvl="5" w:tplc="040B0005" w:tentative="1">
@@ -8274,7 +7896,7 @@
         <w:ind w:left="4320" w:hanging="360"/>
       </w:pPr>
       <w:rPr>
-        <w:rFonts w:ascii="Wingdings" w:hAnsi="Wingdings" w:hint="default"/>
+        <w:rFonts w:hint="default" w:ascii="Wingdings" w:hAnsi="Wingdings"/>
       </w:rPr>
     </w:lvl>
     <w:lvl w:ilvl="6" w:tplc="040B0001" w:tentative="1">
@@ -8286,7 +7908,7 @@
         <w:ind w:left="5040" w:hanging="360"/>
       </w:pPr>
       <w:rPr>
-        <w:rFonts w:ascii="Symbol" w:hAnsi="Symbol" w:hint="default"/>
+        <w:rFonts w:hint="default" w:ascii="Symbol" w:hAnsi="Symbol"/>
       </w:rPr>
     </w:lvl>
     <w:lvl w:ilvl="7" w:tplc="040B0003" w:tentative="1">
@@ -8298,7 +7920,7 @@
         <w:ind w:left="5760" w:hanging="360"/>
       </w:pPr>
       <w:rPr>
-        <w:rFonts w:ascii="Courier New" w:hAnsi="Courier New" w:cs="Courier New" w:hint="default"/>
+        <w:rFonts w:hint="default" w:ascii="Courier New" w:hAnsi="Courier New" w:cs="Courier New"/>
       </w:rPr>
     </w:lvl>
     <w:lvl w:ilvl="8" w:tplc="040B0005" w:tentative="1">
@@ -8310,7 +7932,7 @@
         <w:ind w:left="6480" w:hanging="360"/>
       </w:pPr>
       <w:rPr>
-        <w:rFonts w:ascii="Wingdings" w:hAnsi="Wingdings" w:hint="default"/>
+        <w:rFonts w:hint="default" w:ascii="Wingdings" w:hAnsi="Wingdings"/>
       </w:rPr>
     </w:lvl>
   </w:abstractNum>
@@ -9574,7 +9196,7 @@
         <w:ind w:left="720" w:hanging="360"/>
       </w:pPr>
       <w:rPr>
-        <w:rFonts w:ascii="Aptos" w:eastAsiaTheme="minorHAnsi" w:hAnsi="Aptos" w:cstheme="minorBidi" w:hint="default"/>
+        <w:rFonts w:hint="default" w:ascii="Aptos" w:hAnsi="Aptos" w:eastAsiaTheme="minorHAnsi" w:cstheme="minorBidi"/>
       </w:rPr>
     </w:lvl>
     <w:lvl w:ilvl="1" w:tplc="040B0003">
@@ -9586,7 +9208,7 @@
         <w:ind w:left="1440" w:hanging="360"/>
       </w:pPr>
       <w:rPr>
-        <w:rFonts w:ascii="Courier New" w:hAnsi="Courier New" w:cs="Courier New" w:hint="default"/>
+        <w:rFonts w:hint="default" w:ascii="Courier New" w:hAnsi="Courier New" w:cs="Courier New"/>
       </w:rPr>
     </w:lvl>
     <w:lvl w:ilvl="2" w:tplc="040B0005">
@@ -9598,7 +9220,7 @@
         <w:ind w:left="2160" w:hanging="360"/>
       </w:pPr>
       <w:rPr>
-        <w:rFonts w:ascii="Wingdings" w:hAnsi="Wingdings" w:hint="default"/>
+        <w:rFonts w:hint="default" w:ascii="Wingdings" w:hAnsi="Wingdings"/>
       </w:rPr>
     </w:lvl>
     <w:lvl w:ilvl="3" w:tplc="040B0001" w:tentative="1">
@@ -9610,7 +9232,7 @@
         <w:ind w:left="2880" w:hanging="360"/>
       </w:pPr>
       <w:rPr>
-        <w:rFonts w:ascii="Symbol" w:hAnsi="Symbol" w:hint="default"/>
+        <w:rFonts w:hint="default" w:ascii="Symbol" w:hAnsi="Symbol"/>
       </w:rPr>
     </w:lvl>
     <w:lvl w:ilvl="4" w:tplc="040B0003" w:tentative="1">
@@ -9622,7 +9244,7 @@
         <w:ind w:left="3600" w:hanging="360"/>
       </w:pPr>
       <w:rPr>
-        <w:rFonts w:ascii="Courier New" w:hAnsi="Courier New" w:cs="Courier New" w:hint="default"/>
+        <w:rFonts w:hint="default" w:ascii="Courier New" w:hAnsi="Courier New" w:cs="Courier New"/>
       </w:rPr>
     </w:lvl>
     <w:lvl w:ilvl="5" w:tplc="040B0005" w:tentative="1">
@@ -9634,7 +9256,7 @@
         <w:ind w:left="4320" w:hanging="360"/>
       </w:pPr>
       <w:rPr>
-        <w:rFonts w:ascii="Wingdings" w:hAnsi="Wingdings" w:hint="default"/>
+        <w:rFonts w:hint="default" w:ascii="Wingdings" w:hAnsi="Wingdings"/>
       </w:rPr>
     </w:lvl>
     <w:lvl w:ilvl="6" w:tplc="040B0001" w:tentative="1">
@@ -9646,7 +9268,7 @@
         <w:ind w:left="5040" w:hanging="360"/>
       </w:pPr>
       <w:rPr>
-        <w:rFonts w:ascii="Symbol" w:hAnsi="Symbol" w:hint="default"/>
+        <w:rFonts w:hint="default" w:ascii="Symbol" w:hAnsi="Symbol"/>
       </w:rPr>
     </w:lvl>
     <w:lvl w:ilvl="7" w:tplc="040B0003" w:tentative="1">
@@ -9658,7 +9280,7 @@
         <w:ind w:left="5760" w:hanging="360"/>
       </w:pPr>
       <w:rPr>
-        <w:rFonts w:ascii="Courier New" w:hAnsi="Courier New" w:cs="Courier New" w:hint="default"/>
+        <w:rFonts w:hint="default" w:ascii="Courier New" w:hAnsi="Courier New" w:cs="Courier New"/>
       </w:rPr>
     </w:lvl>
     <w:lvl w:ilvl="8" w:tplc="040B0005" w:tentative="1">
@@ -9670,7 +9292,7 @@
         <w:ind w:left="6480" w:hanging="360"/>
       </w:pPr>
       <w:rPr>
-        <w:rFonts w:ascii="Wingdings" w:hAnsi="Wingdings" w:hint="default"/>
+        <w:rFonts w:hint="default" w:ascii="Wingdings" w:hAnsi="Wingdings"/>
       </w:rPr>
     </w:lvl>
   </w:abstractNum>
@@ -10043,7 +9665,7 @@
         <w:ind w:left="720" w:hanging="360"/>
       </w:pPr>
       <w:rPr>
-        <w:rFonts w:ascii="Aptos" w:eastAsiaTheme="minorHAnsi" w:hAnsi="Aptos" w:cstheme="minorBidi" w:hint="default"/>
+        <w:rFonts w:hint="default" w:ascii="Aptos" w:hAnsi="Aptos" w:eastAsiaTheme="minorHAnsi" w:cstheme="minorBidi"/>
       </w:rPr>
     </w:lvl>
     <w:lvl w:ilvl="1" w:tplc="0C0A0003" w:tentative="1">
@@ -10055,7 +9677,7 @@
         <w:ind w:left="1440" w:hanging="360"/>
       </w:pPr>
       <w:rPr>
-        <w:rFonts w:ascii="Courier New" w:hAnsi="Courier New" w:cs="Courier New" w:hint="default"/>
+        <w:rFonts w:hint="default" w:ascii="Courier New" w:hAnsi="Courier New" w:cs="Courier New"/>
       </w:rPr>
     </w:lvl>
     <w:lvl w:ilvl="2" w:tplc="0C0A0005" w:tentative="1">
@@ -10067,7 +9689,7 @@
         <w:ind w:left="2160" w:hanging="360"/>
       </w:pPr>
       <w:rPr>
-        <w:rFonts w:ascii="Wingdings" w:hAnsi="Wingdings" w:hint="default"/>
+        <w:rFonts w:hint="default" w:ascii="Wingdings" w:hAnsi="Wingdings"/>
       </w:rPr>
     </w:lvl>
     <w:lvl w:ilvl="3" w:tplc="0C0A0001" w:tentative="1">
@@ -10079,7 +9701,7 @@
         <w:ind w:left="2880" w:hanging="360"/>
       </w:pPr>
       <w:rPr>
-        <w:rFonts w:ascii="Symbol" w:hAnsi="Symbol" w:hint="default"/>
+        <w:rFonts w:hint="default" w:ascii="Symbol" w:hAnsi="Symbol"/>
       </w:rPr>
     </w:lvl>
     <w:lvl w:ilvl="4" w:tplc="0C0A0003" w:tentative="1">
@@ -10091,7 +9713,7 @@
         <w:ind w:left="3600" w:hanging="360"/>
       </w:pPr>
       <w:rPr>
-        <w:rFonts w:ascii="Courier New" w:hAnsi="Courier New" w:cs="Courier New" w:hint="default"/>
+        <w:rFonts w:hint="default" w:ascii="Courier New" w:hAnsi="Courier New" w:cs="Courier New"/>
       </w:rPr>
     </w:lvl>
     <w:lvl w:ilvl="5" w:tplc="0C0A0005" w:tentative="1">
@@ -10103,7 +9725,7 @@
         <w:ind w:left="4320" w:hanging="360"/>
       </w:pPr>
       <w:rPr>
-        <w:rFonts w:ascii="Wingdings" w:hAnsi="Wingdings" w:hint="default"/>
+        <w:rFonts w:hint="default" w:ascii="Wingdings" w:hAnsi="Wingdings"/>
       </w:rPr>
     </w:lvl>
     <w:lvl w:ilvl="6" w:tplc="0C0A0001" w:tentative="1">
@@ -10115,7 +9737,7 @@
         <w:ind w:left="5040" w:hanging="360"/>
       </w:pPr>
       <w:rPr>
-        <w:rFonts w:ascii="Symbol" w:hAnsi="Symbol" w:hint="default"/>
+        <w:rFonts w:hint="default" w:ascii="Symbol" w:hAnsi="Symbol"/>
       </w:rPr>
     </w:lvl>
     <w:lvl w:ilvl="7" w:tplc="0C0A0003" w:tentative="1">
@@ -10127,7 +9749,7 @@
         <w:ind w:left="5760" w:hanging="360"/>
       </w:pPr>
       <w:rPr>
-        <w:rFonts w:ascii="Courier New" w:hAnsi="Courier New" w:cs="Courier New" w:hint="default"/>
+        <w:rFonts w:hint="default" w:ascii="Courier New" w:hAnsi="Courier New" w:cs="Courier New"/>
       </w:rPr>
     </w:lvl>
     <w:lvl w:ilvl="8" w:tplc="0C0A0005" w:tentative="1">
@@ -10139,7 +9761,7 @@
         <w:ind w:left="6480" w:hanging="360"/>
       </w:pPr>
       <w:rPr>
-        <w:rFonts w:ascii="Wingdings" w:hAnsi="Wingdings" w:hint="default"/>
+        <w:rFonts w:hint="default" w:ascii="Wingdings" w:hAnsi="Wingdings"/>
       </w:rPr>
     </w:lvl>
   </w:abstractNum>
@@ -10458,11 +10080,11 @@
 </file>
 
 <file path=word/styles.xml><?xml version="1.0" encoding="utf-8"?>
-<w:styles xmlns:mc="http://schemas.openxmlformats.org/markup-compatibility/2006" xmlns:r="http://schemas.openxmlformats.org/officeDocument/2006/relationships" xmlns:w="http://schemas.openxmlformats.org/wordprocessingml/2006/main" xmlns:w14="http://schemas.microsoft.com/office/word/2010/wordml" xmlns:w15="http://schemas.microsoft.com/office/word/2012/wordml" xmlns:w16cex="http://schemas.microsoft.com/office/word/2018/wordml/cex" xmlns:w16cid="http://schemas.microsoft.com/office/word/2016/wordml/cid" xmlns:w16="http://schemas.microsoft.com/office/word/2018/wordml" xmlns:w16du="http://schemas.microsoft.com/office/word/2023/wordml/word16du" xmlns:w16sdtdh="http://schemas.microsoft.com/office/word/2020/wordml/sdtdatahash" xmlns:w16sdtfl="http://schemas.microsoft.com/office/word/2024/wordml/sdtformatlock" xmlns:w16se="http://schemas.microsoft.com/office/word/2015/wordml/symex" mc:Ignorable="w14 w15 w16se w16cid w16 w16cex w16sdtdh w16sdtfl w16du">
+<w:styles xmlns:wp14="http://schemas.microsoft.com/office/word/2010/wordprocessingDrawing" xmlns:mc="http://schemas.openxmlformats.org/markup-compatibility/2006" xmlns:r="http://schemas.openxmlformats.org/officeDocument/2006/relationships" xmlns:w="http://schemas.openxmlformats.org/wordprocessingml/2006/main" xmlns:w14="http://schemas.microsoft.com/office/word/2010/wordml" xmlns:w15="http://schemas.microsoft.com/office/word/2012/wordml" xmlns:w16cex="http://schemas.microsoft.com/office/word/2018/wordml/cex" xmlns:w16cid="http://schemas.microsoft.com/office/word/2016/wordml/cid" xmlns:w16="http://schemas.microsoft.com/office/word/2018/wordml" xmlns:w16du="http://schemas.microsoft.com/office/word/2023/wordml/word16du" xmlns:w16sdtdh="http://schemas.microsoft.com/office/word/2020/wordml/sdtdatahash" xmlns:w16sdtfl="http://schemas.microsoft.com/office/word/2024/wordml/sdtformatlock" xmlns:w16se="http://schemas.microsoft.com/office/word/2015/wordml/symex" mc:Ignorable="w14 w15 w16se w16cid w16 w16cex w16sdtdh w16sdtfl w16du wp14">
   <w:docDefaults>
     <w:rPrDefault>
       <w:rPr>
-        <w:rFonts w:asciiTheme="minorHAnsi" w:eastAsiaTheme="minorHAnsi" w:hAnsiTheme="minorHAnsi" w:cstheme="minorBidi"/>
+        <w:rFonts w:asciiTheme="minorHAnsi" w:hAnsiTheme="minorHAnsi" w:eastAsiaTheme="minorHAnsi" w:cstheme="minorBidi"/>
         <w:kern w:val="2"/>
         <w:sz w:val="22"/>
         <w:szCs w:val="22"/>
@@ -10479,14 +10101,14 @@
   <w:latentStyles w:defLockedState="0" w:defUIPriority="99" w:defSemiHidden="0" w:defUnhideWhenUsed="0" w:defQFormat="0" w:count="376">
     <w:lsdException w:name="Normal" w:uiPriority="0" w:qFormat="1"/>
     <w:lsdException w:name="heading 1" w:uiPriority="9" w:qFormat="1"/>
-    <w:lsdException w:name="heading 2" w:semiHidden="1" w:uiPriority="9" w:unhideWhenUsed="1" w:qFormat="1"/>
-    <w:lsdException w:name="heading 3" w:semiHidden="1" w:uiPriority="9" w:unhideWhenUsed="1" w:qFormat="1"/>
-    <w:lsdException w:name="heading 4" w:semiHidden="1" w:uiPriority="9" w:unhideWhenUsed="1" w:qFormat="1"/>
-    <w:lsdException w:name="heading 5" w:semiHidden="1" w:uiPriority="9" w:unhideWhenUsed="1" w:qFormat="1"/>
-    <w:lsdException w:name="heading 6" w:semiHidden="1" w:uiPriority="9" w:unhideWhenUsed="1" w:qFormat="1"/>
-    <w:lsdException w:name="heading 7" w:semiHidden="1" w:uiPriority="9" w:unhideWhenUsed="1" w:qFormat="1"/>
-    <w:lsdException w:name="heading 8" w:semiHidden="1" w:uiPriority="9" w:unhideWhenUsed="1" w:qFormat="1"/>
-    <w:lsdException w:name="heading 9" w:semiHidden="1" w:uiPriority="9" w:unhideWhenUsed="1" w:qFormat="1"/>
+    <w:lsdException w:name="heading 2" w:uiPriority="9" w:semiHidden="1" w:unhideWhenUsed="1" w:qFormat="1"/>
+    <w:lsdException w:name="heading 3" w:uiPriority="9" w:semiHidden="1" w:unhideWhenUsed="1" w:qFormat="1"/>
+    <w:lsdException w:name="heading 4" w:uiPriority="9" w:semiHidden="1" w:unhideWhenUsed="1" w:qFormat="1"/>
+    <w:lsdException w:name="heading 5" w:uiPriority="9" w:semiHidden="1" w:unhideWhenUsed="1" w:qFormat="1"/>
+    <w:lsdException w:name="heading 6" w:uiPriority="9" w:semiHidden="1" w:unhideWhenUsed="1" w:qFormat="1"/>
+    <w:lsdException w:name="heading 7" w:uiPriority="9" w:semiHidden="1" w:unhideWhenUsed="1" w:qFormat="1"/>
+    <w:lsdException w:name="heading 8" w:uiPriority="9" w:semiHidden="1" w:unhideWhenUsed="1" w:qFormat="1"/>
+    <w:lsdException w:name="heading 9" w:uiPriority="9" w:semiHidden="1" w:unhideWhenUsed="1" w:qFormat="1"/>
     <w:lsdException w:name="index 1" w:semiHidden="1" w:unhideWhenUsed="1"/>
     <w:lsdException w:name="index 2" w:semiHidden="1" w:unhideWhenUsed="1"/>
     <w:lsdException w:name="index 3" w:semiHidden="1" w:unhideWhenUsed="1"/>
@@ -10496,22 +10118,22 @@
     <w:lsdException w:name="index 7" w:semiHidden="1" w:unhideWhenUsed="1"/>
     <w:lsdException w:name="index 8" w:semiHidden="1" w:unhideWhenUsed="1"/>
     <w:lsdException w:name="index 9" w:semiHidden="1" w:unhideWhenUsed="1"/>
-    <w:lsdException w:name="toc 1" w:semiHidden="1" w:uiPriority="39" w:unhideWhenUsed="1"/>
-    <w:lsdException w:name="toc 2" w:semiHidden="1" w:uiPriority="39" w:unhideWhenUsed="1"/>
-    <w:lsdException w:name="toc 3" w:semiHidden="1" w:uiPriority="39" w:unhideWhenUsed="1"/>
-    <w:lsdException w:name="toc 4" w:semiHidden="1" w:uiPriority="39" w:unhideWhenUsed="1"/>
-    <w:lsdException w:name="toc 5" w:semiHidden="1" w:uiPriority="39" w:unhideWhenUsed="1"/>
-    <w:lsdException w:name="toc 6" w:semiHidden="1" w:uiPriority="39" w:unhideWhenUsed="1"/>
-    <w:lsdException w:name="toc 7" w:semiHidden="1" w:uiPriority="39" w:unhideWhenUsed="1"/>
-    <w:lsdException w:name="toc 8" w:semiHidden="1" w:uiPriority="39" w:unhideWhenUsed="1"/>
-    <w:lsdException w:name="toc 9" w:semiHidden="1" w:uiPriority="39" w:unhideWhenUsed="1"/>
+    <w:lsdException w:name="toc 1" w:uiPriority="39" w:semiHidden="1" w:unhideWhenUsed="1"/>
+    <w:lsdException w:name="toc 2" w:uiPriority="39" w:semiHidden="1" w:unhideWhenUsed="1"/>
+    <w:lsdException w:name="toc 3" w:uiPriority="39" w:semiHidden="1" w:unhideWhenUsed="1"/>
+    <w:lsdException w:name="toc 4" w:uiPriority="39" w:semiHidden="1" w:unhideWhenUsed="1"/>
+    <w:lsdException w:name="toc 5" w:uiPriority="39" w:semiHidden="1" w:unhideWhenUsed="1"/>
+    <w:lsdException w:name="toc 6" w:uiPriority="39" w:semiHidden="1" w:unhideWhenUsed="1"/>
+    <w:lsdException w:name="toc 7" w:uiPriority="39" w:semiHidden="1" w:unhideWhenUsed="1"/>
+    <w:lsdException w:name="toc 8" w:uiPriority="39" w:semiHidden="1" w:unhideWhenUsed="1"/>
+    <w:lsdException w:name="toc 9" w:uiPriority="39" w:semiHidden="1" w:unhideWhenUsed="1"/>
     <w:lsdException w:name="Normal Indent" w:semiHidden="1" w:unhideWhenUsed="1"/>
     <w:lsdException w:name="footnote text" w:semiHidden="1" w:unhideWhenUsed="1"/>
     <w:lsdException w:name="annotation text" w:semiHidden="1" w:unhideWhenUsed="1"/>
     <w:lsdException w:name="header" w:semiHidden="1" w:unhideWhenUsed="1"/>
     <w:lsdException w:name="footer" w:semiHidden="1" w:unhideWhenUsed="1"/>
     <w:lsdException w:name="index heading" w:semiHidden="1" w:unhideWhenUsed="1"/>
-    <w:lsdException w:name="caption" w:semiHidden="1" w:uiPriority="35" w:unhideWhenUsed="1" w:qFormat="1"/>
+    <w:lsdException w:name="caption" w:uiPriority="35" w:semiHidden="1" w:unhideWhenUsed="1" w:qFormat="1"/>
     <w:lsdException w:name="table of figures" w:semiHidden="1" w:unhideWhenUsed="1"/>
     <w:lsdException w:name="envelope address" w:semiHidden="1" w:unhideWhenUsed="1"/>
     <w:lsdException w:name="envelope return" w:semiHidden="1" w:unhideWhenUsed="1"/>
@@ -10542,7 +10164,7 @@
     <w:lsdException w:name="Title" w:uiPriority="10" w:qFormat="1"/>
     <w:lsdException w:name="Closing" w:semiHidden="1" w:unhideWhenUsed="1"/>
     <w:lsdException w:name="Signature" w:semiHidden="1" w:unhideWhenUsed="1"/>
-    <w:lsdException w:name="Default Paragraph Font" w:semiHidden="1" w:uiPriority="1" w:unhideWhenUsed="1"/>
+    <w:lsdException w:name="Default Paragraph Font" w:uiPriority="1" w:semiHidden="1" w:unhideWhenUsed="1"/>
     <w:lsdException w:name="Body Text" w:semiHidden="1" w:unhideWhenUsed="1"/>
     <w:lsdException w:name="Body Text Indent" w:semiHidden="1" w:unhideWhenUsed="1"/>
     <w:lsdException w:name="List Continue" w:semiHidden="1" w:unhideWhenUsed="1"/>
@@ -10742,8 +10364,8 @@
     <w:lsdException w:name="Subtle Reference" w:uiPriority="31" w:qFormat="1"/>
     <w:lsdException w:name="Intense Reference" w:uiPriority="32" w:qFormat="1"/>
     <w:lsdException w:name="Book Title" w:uiPriority="33" w:qFormat="1"/>
-    <w:lsdException w:name="Bibliography" w:semiHidden="1" w:uiPriority="37" w:unhideWhenUsed="1"/>
-    <w:lsdException w:name="TOC Heading" w:semiHidden="1" w:uiPriority="39" w:unhideWhenUsed="1" w:qFormat="1"/>
+    <w:lsdException w:name="Bibliography" w:uiPriority="37" w:semiHidden="1" w:unhideWhenUsed="1"/>
+    <w:lsdException w:name="TOC Heading" w:uiPriority="39" w:semiHidden="1" w:unhideWhenUsed="1" w:qFormat="1"/>
     <w:lsdException w:name="Plain Table 1" w:uiPriority="41"/>
     <w:lsdException w:name="Plain Table 2" w:uiPriority="42"/>
     <w:lsdException w:name="Plain Table 3" w:uiPriority="43"/>
@@ -10854,7 +10476,7 @@
     <w:lsdException w:name="Unresolved Mention" w:semiHidden="1" w:unhideWhenUsed="1"/>
     <w:lsdException w:name="Smart Link" w:semiHidden="1" w:unhideWhenUsed="1"/>
   </w:latentStyles>
-  <w:style w:type="paragraph" w:default="1" w:styleId="Normal">
+  <w:style w:type="paragraph" w:styleId="Normal" w:default="1">
     <w:name w:val="Normal"/>
     <w:qFormat/>
     <w:rsid w:val="00135911"/>
@@ -10874,7 +10496,7 @@
       <w:outlineLvl w:val="0"/>
     </w:pPr>
     <w:rPr>
-      <w:rFonts w:asciiTheme="majorHAnsi" w:eastAsiaTheme="majorEastAsia" w:hAnsiTheme="majorHAnsi" w:cstheme="majorBidi"/>
+      <w:rFonts w:asciiTheme="majorHAnsi" w:hAnsiTheme="majorHAnsi" w:eastAsiaTheme="majorEastAsia" w:cstheme="majorBidi"/>
       <w:color w:val="0F4761" w:themeColor="accent1" w:themeShade="BF"/>
       <w:sz w:val="40"/>
       <w:szCs w:val="40"/>
@@ -10897,7 +10519,7 @@
       <w:outlineLvl w:val="1"/>
     </w:pPr>
     <w:rPr>
-      <w:rFonts w:asciiTheme="majorHAnsi" w:eastAsiaTheme="majorEastAsia" w:hAnsiTheme="majorHAnsi" w:cstheme="majorBidi"/>
+      <w:rFonts w:asciiTheme="majorHAnsi" w:hAnsiTheme="majorHAnsi" w:eastAsiaTheme="majorEastAsia" w:cstheme="majorBidi"/>
       <w:i/>
       <w:color w:val="002060"/>
       <w:sz w:val="24"/>
@@ -11057,12 +10679,12 @@
       <w:color w:val="272727" w:themeColor="text1" w:themeTint="D8"/>
     </w:rPr>
   </w:style>
-  <w:style w:type="character" w:default="1" w:styleId="DefaultParagraphFont">
+  <w:style w:type="character" w:styleId="DefaultParagraphFont" w:default="1">
     <w:name w:val="Default Paragraph Font"/>
     <w:uiPriority w:val="1"/>
     <w:unhideWhenUsed/>
   </w:style>
-  <w:style w:type="table" w:default="1" w:styleId="TableNormal">
+  <w:style w:type="table" w:styleId="TableNormal" w:default="1">
     <w:name w:val="Normal Table"/>
     <w:uiPriority w:val="99"/>
     <w:semiHidden/>
@@ -11077,40 +10699,40 @@
       </w:tblCellMar>
     </w:tblPr>
   </w:style>
-  <w:style w:type="numbering" w:default="1" w:styleId="NoList">
+  <w:style w:type="numbering" w:styleId="NoList" w:default="1">
     <w:name w:val="No List"/>
     <w:uiPriority w:val="99"/>
     <w:semiHidden/>
     <w:unhideWhenUsed/>
   </w:style>
-  <w:style w:type="character" w:customStyle="1" w:styleId="Heading1Char">
+  <w:style w:type="character" w:styleId="Heading1Char" w:customStyle="1">
     <w:name w:val="Heading 1 Char"/>
     <w:basedOn w:val="DefaultParagraphFont"/>
     <w:link w:val="Heading1"/>
     <w:uiPriority w:val="9"/>
     <w:rsid w:val="00A55B03"/>
     <w:rPr>
-      <w:rFonts w:asciiTheme="majorHAnsi" w:eastAsiaTheme="majorEastAsia" w:hAnsiTheme="majorHAnsi" w:cstheme="majorBidi"/>
+      <w:rFonts w:asciiTheme="majorHAnsi" w:hAnsiTheme="majorHAnsi" w:eastAsiaTheme="majorEastAsia" w:cstheme="majorBidi"/>
       <w:color w:val="0F4761" w:themeColor="accent1" w:themeShade="BF"/>
       <w:sz w:val="40"/>
       <w:szCs w:val="40"/>
     </w:rPr>
   </w:style>
-  <w:style w:type="character" w:customStyle="1" w:styleId="Heading2Char">
+  <w:style w:type="character" w:styleId="Heading2Char" w:customStyle="1">
     <w:name w:val="Heading 2 Char"/>
     <w:basedOn w:val="DefaultParagraphFont"/>
     <w:link w:val="Heading2"/>
     <w:uiPriority w:val="9"/>
     <w:rsid w:val="00331AE3"/>
     <w:rPr>
-      <w:rFonts w:asciiTheme="majorHAnsi" w:eastAsiaTheme="majorEastAsia" w:hAnsiTheme="majorHAnsi" w:cstheme="majorBidi"/>
+      <w:rFonts w:asciiTheme="majorHAnsi" w:hAnsiTheme="majorHAnsi" w:eastAsiaTheme="majorEastAsia" w:cstheme="majorBidi"/>
       <w:i/>
       <w:color w:val="002060"/>
       <w:sz w:val="24"/>
       <w:szCs w:val="32"/>
     </w:rPr>
   </w:style>
-  <w:style w:type="character" w:customStyle="1" w:styleId="Heading3Char">
+  <w:style w:type="character" w:styleId="Heading3Char" w:customStyle="1">
     <w:name w:val="Heading 3 Char"/>
     <w:basedOn w:val="DefaultParagraphFont"/>
     <w:link w:val="Heading3"/>
@@ -11123,7 +10745,7 @@
       <w:szCs w:val="28"/>
     </w:rPr>
   </w:style>
-  <w:style w:type="character" w:customStyle="1" w:styleId="Heading4Char">
+  <w:style w:type="character" w:styleId="Heading4Char" w:customStyle="1">
     <w:name w:val="Heading 4 Char"/>
     <w:basedOn w:val="DefaultParagraphFont"/>
     <w:link w:val="Heading4"/>
@@ -11136,7 +10758,7 @@
       <w:color w:val="0F4761" w:themeColor="accent1" w:themeShade="BF"/>
     </w:rPr>
   </w:style>
-  <w:style w:type="character" w:customStyle="1" w:styleId="Heading5Char">
+  <w:style w:type="character" w:styleId="Heading5Char" w:customStyle="1">
     <w:name w:val="Heading 5 Char"/>
     <w:basedOn w:val="DefaultParagraphFont"/>
     <w:link w:val="Heading5"/>
@@ -11148,7 +10770,7 @@
       <w:color w:val="0F4761" w:themeColor="accent1" w:themeShade="BF"/>
     </w:rPr>
   </w:style>
-  <w:style w:type="character" w:customStyle="1" w:styleId="Heading6Char">
+  <w:style w:type="character" w:styleId="Heading6Char" w:customStyle="1">
     <w:name w:val="Heading 6 Char"/>
     <w:basedOn w:val="DefaultParagraphFont"/>
     <w:link w:val="Heading6"/>
@@ -11162,7 +10784,7 @@
       <w:color w:val="595959" w:themeColor="text1" w:themeTint="A6"/>
     </w:rPr>
   </w:style>
-  <w:style w:type="character" w:customStyle="1" w:styleId="Heading7Char">
+  <w:style w:type="character" w:styleId="Heading7Char" w:customStyle="1">
     <w:name w:val="Heading 7 Char"/>
     <w:basedOn w:val="DefaultParagraphFont"/>
     <w:link w:val="Heading7"/>
@@ -11174,7 +10796,7 @@
       <w:color w:val="595959" w:themeColor="text1" w:themeTint="A6"/>
     </w:rPr>
   </w:style>
-  <w:style w:type="character" w:customStyle="1" w:styleId="Heading8Char">
+  <w:style w:type="character" w:styleId="Heading8Char" w:customStyle="1">
     <w:name w:val="Heading 8 Char"/>
     <w:basedOn w:val="DefaultParagraphFont"/>
     <w:link w:val="Heading8"/>
@@ -11188,7 +10810,7 @@
       <w:color w:val="272727" w:themeColor="text1" w:themeTint="D8"/>
     </w:rPr>
   </w:style>
-  <w:style w:type="character" w:customStyle="1" w:styleId="Heading9Char">
+  <w:style w:type="character" w:styleId="Heading9Char" w:customStyle="1">
     <w:name w:val="Heading 9 Char"/>
     <w:basedOn w:val="DefaultParagraphFont"/>
     <w:link w:val="Heading9"/>
@@ -11213,21 +10835,21 @@
       <w:contextualSpacing/>
     </w:pPr>
     <w:rPr>
-      <w:rFonts w:asciiTheme="majorHAnsi" w:eastAsiaTheme="majorEastAsia" w:hAnsiTheme="majorHAnsi" w:cstheme="majorBidi"/>
+      <w:rFonts w:asciiTheme="majorHAnsi" w:hAnsiTheme="majorHAnsi" w:eastAsiaTheme="majorEastAsia" w:cstheme="majorBidi"/>
       <w:spacing w:val="-10"/>
       <w:kern w:val="28"/>
       <w:sz w:val="56"/>
       <w:szCs w:val="56"/>
     </w:rPr>
   </w:style>
-  <w:style w:type="character" w:customStyle="1" w:styleId="TitleChar">
+  <w:style w:type="character" w:styleId="TitleChar" w:customStyle="1">
     <w:name w:val="Title Char"/>
     <w:basedOn w:val="DefaultParagraphFont"/>
     <w:link w:val="Title"/>
     <w:uiPriority w:val="10"/>
     <w:rsid w:val="00A55B03"/>
     <w:rPr>
-      <w:rFonts w:asciiTheme="majorHAnsi" w:eastAsiaTheme="majorEastAsia" w:hAnsiTheme="majorHAnsi" w:cstheme="majorBidi"/>
+      <w:rFonts w:asciiTheme="majorHAnsi" w:hAnsiTheme="majorHAnsi" w:eastAsiaTheme="majorEastAsia" w:cstheme="majorBidi"/>
       <w:spacing w:val="-10"/>
       <w:kern w:val="28"/>
       <w:sz w:val="56"/>
@@ -11255,7 +10877,7 @@
       <w:szCs w:val="28"/>
     </w:rPr>
   </w:style>
-  <w:style w:type="character" w:customStyle="1" w:styleId="SubtitleChar">
+  <w:style w:type="character" w:styleId="SubtitleChar" w:customStyle="1">
     <w:name w:val="Subtitle Char"/>
     <w:basedOn w:val="DefaultParagraphFont"/>
     <w:link w:val="Subtitle"/>
@@ -11287,7 +10909,7 @@
       <w:color w:val="404040" w:themeColor="text1" w:themeTint="BF"/>
     </w:rPr>
   </w:style>
-  <w:style w:type="character" w:customStyle="1" w:styleId="QuoteChar">
+  <w:style w:type="character" w:styleId="QuoteChar" w:customStyle="1">
     <w:name w:val="Quote Char"/>
     <w:basedOn w:val="DefaultParagraphFont"/>
     <w:link w:val="Quote"/>
@@ -11332,8 +10954,8 @@
     <w:rsid w:val="00A55B03"/>
     <w:pPr>
       <w:pBdr>
-        <w:top w:val="single" w:sz="4" w:space="10" w:color="0F4761" w:themeColor="accent1" w:themeShade="BF"/>
-        <w:bottom w:val="single" w:sz="4" w:space="10" w:color="0F4761" w:themeColor="accent1" w:themeShade="BF"/>
+        <w:top w:val="single" w:color="0F4761" w:themeColor="accent1" w:themeShade="BF" w:sz="4" w:space="10"/>
+        <w:bottom w:val="single" w:color="0F4761" w:themeColor="accent1" w:themeShade="BF" w:sz="4" w:space="10"/>
       </w:pBdr>
       <w:spacing w:before="360" w:after="360"/>
       <w:ind w:left="864" w:right="864"/>
@@ -11345,7 +10967,7 @@
       <w:color w:val="0F4761" w:themeColor="accent1" w:themeShade="BF"/>
     </w:rPr>
   </w:style>
-  <w:style w:type="character" w:customStyle="1" w:styleId="IntenseQuoteChar">
+  <w:style w:type="character" w:styleId="IntenseQuoteChar" w:customStyle="1">
     <w:name w:val="Intense Quote Char"/>
     <w:basedOn w:val="DefaultParagraphFont"/>
     <w:link w:val="IntenseQuote"/>
@@ -11382,7 +11004,7 @@
       <w:u w:val="single"/>
     </w:rPr>
   </w:style>
-  <w:style w:type="character" w:customStyle="1" w:styleId="Mencinsinresolver1">
+  <w:style w:type="character" w:styleId="Mencinsinresolver1" w:customStyle="1">
     <w:name w:val="Mención sin resolver1"/>
     <w:basedOn w:val="DefaultParagraphFont"/>
     <w:uiPriority w:val="99"/>
@@ -11407,7 +11029,7 @@
     </w:rPr>
   </w:style>
   <w:style w:type="character" w:styleId="CommentReference">
-    <w:name w:val="annotation reference"/>
+    <w:name w:val="Comment Reference"/>
     <w:basedOn w:val="DefaultParagraphFont"/>
     <w:uiPriority w:val="99"/>
     <w:semiHidden/>
@@ -11419,7 +11041,7 @@
     </w:rPr>
   </w:style>
   <w:style w:type="paragraph" w:styleId="CommentText">
-    <w:name w:val="annotation text"/>
+    <w:name w:val="Comment Text"/>
     <w:basedOn w:val="Normal"/>
     <w:link w:val="CommentTextChar"/>
     <w:uiPriority w:val="99"/>
@@ -11433,7 +11055,7 @@
       <w:szCs w:val="20"/>
     </w:rPr>
   </w:style>
-  <w:style w:type="character" w:customStyle="1" w:styleId="CommentTextChar">
+  <w:style w:type="character" w:styleId="CommentTextChar" w:customStyle="1">
     <w:name w:val="Comment Text Char"/>
     <w:basedOn w:val="DefaultParagraphFont"/>
     <w:link w:val="CommentText"/>
@@ -11445,7 +11067,7 @@
     </w:rPr>
   </w:style>
   <w:style w:type="paragraph" w:styleId="CommentSubject">
-    <w:name w:val="annotation subject"/>
+    <w:name w:val="Comment Subject"/>
     <w:basedOn w:val="CommentText"/>
     <w:next w:val="CommentText"/>
     <w:link w:val="CommentSubjectChar"/>
@@ -11458,7 +11080,7 @@
       <w:bCs/>
     </w:rPr>
   </w:style>
-  <w:style w:type="character" w:customStyle="1" w:styleId="CommentSubjectChar">
+  <w:style w:type="character" w:styleId="CommentSubjectChar" w:customStyle="1">
     <w:name w:val="Comment Subject Char"/>
     <w:basedOn w:val="CommentTextChar"/>
     <w:link w:val="CommentSubject"/>
@@ -11489,7 +11111,7 @@
       <w:szCs w:val="18"/>
     </w:rPr>
   </w:style>
-  <w:style w:type="character" w:customStyle="1" w:styleId="BalloonTextChar">
+  <w:style w:type="character" w:styleId="BalloonTextChar" w:customStyle="1">
     <w:name w:val="Balloon Text Char"/>
     <w:basedOn w:val="DefaultParagraphFont"/>
     <w:link w:val="BalloonText"/>
@@ -11529,7 +11151,7 @@
 </file>
 
 <file path=word/theme/theme1.xml><?xml version="1.0" encoding="utf-8"?>
-<a:theme xmlns:a="http://schemas.openxmlformats.org/drawingml/2006/main" name="Office Theme">
+<a:theme xmlns:a="http://schemas.openxmlformats.org/drawingml/2006/main" xmlns:thm15="http://schemas.microsoft.com/office/thememl/2012/main" name="Office Theme">
   <a:themeElements>
     <a:clrScheme name="Office">
       <a:dk1>

</xml_diff>